<commit_message>
docs: add master progress report index and change report
</commit_message>
<xml_diff>
--- a/docs/Change_Report.docx
+++ b/docs/Change_Report.docx
@@ -2,75 +2,32 @@
 <file path=word/document.xml><?xml version="1.0" encoding="utf-8"?>
 <w:document xmlns:wpc="http://schemas.microsoft.com/office/word/2010/wordprocessingCanvas" xmlns:mo="http://schemas.microsoft.com/office/mac/office/2008/main" xmlns:mc="http://schemas.openxmlformats.org/markup-compatibility/2006" xmlns:mv="urn:schemas-microsoft-com:mac:vml" xmlns:o="urn:schemas-microsoft-com:office:office" xmlns:r="http://schemas.openxmlformats.org/officeDocument/2006/relationships" xmlns:m="http://schemas.openxmlformats.org/officeDocument/2006/math" xmlns:v="urn:schemas-microsoft-com:vml" xmlns:wp14="http://schemas.microsoft.com/office/word/2010/wordprocessingDrawing" xmlns:wp="http://schemas.openxmlformats.org/drawingml/2006/wordprocessingDrawing" xmlns:w10="urn:schemas-microsoft-com:office:word" xmlns:w="http://schemas.openxmlformats.org/wordprocessingml/2006/main" xmlns:w14="http://schemas.microsoft.com/office/word/2010/wordml" xmlns:wpg="http://schemas.microsoft.com/office/word/2010/wordprocessingGroup" xmlns:wpi="http://schemas.microsoft.com/office/word/2010/wordprocessingInk" xmlns:wne="http://schemas.microsoft.com/office/word/2006/wordml" xmlns:wps="http://schemas.microsoft.com/office/word/2010/wordprocessingShape" mc:Ignorable="w14 wp14">
   <w:body>
-    <w:p/>
-    <w:p/>
-    <w:p/>
     <w:p>
       <w:pPr>
-        <w:jc w:val="center"/>
+        <w:pStyle w:val="Title"/>
       </w:pPr>
       <w:r>
         <w:rPr>
           <w:b/>
-          <w:color w:val="003366"/>
-          <w:sz w:val="56"/>
+          <w:color w:val="102C57"/>
+          <w:sz w:val="48"/>
         </w:rPr>
-        <w:t>Change Report</w:t>
+        <w:t>Social Media Sentiment Analysis: Master Progress Report &amp; Index</w:t>
       </w:r>
     </w:p>
     <w:p>
       <w:pPr>
-        <w:jc w:val="center"/>
+        <w:jc w:val="right"/>
       </w:pPr>
       <w:r>
         <w:rPr>
-          <w:color w:val="464646"/>
-          <w:sz w:val="36"/>
+          <w:i/>
+          <w:color w:val="646464"/>
+          <w:sz w:val="19"/>
         </w:rPr>
-        <w:t>Social Media Sentiment Analysis Project</w:t>
-      </w:r>
-    </w:p>
-    <w:p/>
-    <w:p>
-      <w:pPr>
-        <w:jc w:val="center"/>
-      </w:pPr>
-      <w:r>
-        <w:rPr>
-          <w:color w:val="646464"/>
-          <w:sz w:val="24"/>
-        </w:rPr>
-        <w:t>Date: 26 July 2026</w:t>
-      </w:r>
-    </w:p>
-    <w:p/>
-    <w:p>
-      <w:pPr>
-        <w:jc w:val="center"/>
-      </w:pPr>
-      <w:r>
-        <w:rPr>
-          <w:color w:val="646464"/>
-          <w:sz w:val="22"/>
-        </w:rPr>
-        <w:t>Team: Rishabh, Swarni, Daksha, Prathamesh, Manvi, Sai</w:t>
-      </w:r>
-    </w:p>
-    <w:p>
-      <w:pPr>
-        <w:jc w:val="center"/>
-      </w:pPr>
-      <w:r>
-        <w:rPr>
-          <w:color w:val="646464"/>
-          <w:sz w:val="22"/>
-        </w:rPr>
-        <w:t>Statistical Fundamentals Course — B.Sc. 2nd Year</w:t>
-      </w:r>
-    </w:p>
-    <w:p>
-      <w:r>
-        <w:br w:type="page"/>
+        <w:t>Timeline: Day 1 (2026-07-22) to Tomorrow (2026-07-30)</w:t>
+        <w:br/>
+        <w:t>Last Updated: 2026-07-29</w:t>
       </w:r>
     </w:p>
     <w:p>
@@ -79,84 +36,105 @@
       </w:pPr>
       <w:r>
         <w:rPr>
-          <w:color w:val="003366"/>
+          <w:b/>
+          <w:color w:val="1E56A0"/>
+          <w:sz w:val="32"/>
         </w:rPr>
-        <w:t>1. Summary of Changes</w:t>
+        <w:t>1. Executive Overview &amp; Index</w:t>
+      </w:r>
+    </w:p>
+    <w:p>
+      <w:r>
+        <w:rPr>
+          <w:rFonts w:ascii="Segoe UI" w:hAnsi="Segoe UI"/>
+          <w:b w:val="0"/>
+          <w:i w:val="0"/>
+          <w:sz w:val="21"/>
+        </w:rPr>
+        <w:t>This document provides a comprehensive chronological index of all development phases, architectural refactorings, machine learning model enhancements, UI iterations, and future roadmaps for the Social Media Sentiment Analysis project.</w:t>
       </w:r>
     </w:p>
     <w:p>
       <w:pPr>
-        <w:spacing w:after="120"/>
+        <w:pStyle w:val="Heading2"/>
       </w:pPr>
       <w:r>
-        <w:t>The following files were created, modified, or deleted as part of this update:</w:t>
+        <w:rPr>
+          <w:b/>
+          <w:color w:val="35A29F"/>
+          <w:sz w:val="26"/>
+        </w:rPr>
+        <w:t>Report Index</w:t>
       </w:r>
     </w:p>
     <w:tbl>
       <w:tblPr>
-        <w:tblStyle w:val="LightGrid-Accent1"/>
         <w:tblW w:type="auto" w:w="0"/>
         <w:jc w:val="center"/>
         <w:tblLook w:firstColumn="1" w:firstRow="1" w:lastColumn="0" w:lastRow="0" w:noHBand="0" w:noVBand="1" w:val="04A0"/>
       </w:tblPr>
       <w:tblGrid>
-        <w:gridCol w:w="2351"/>
-        <w:gridCol w:w="2351"/>
-        <w:gridCol w:w="2351"/>
-        <w:gridCol w:w="2351"/>
+        <w:gridCol w:w="2160"/>
+        <w:gridCol w:w="2160"/>
+        <w:gridCol w:w="2160"/>
+        <w:gridCol w:w="2160"/>
       </w:tblGrid>
       <w:tr>
         <w:tc>
           <w:tcPr>
-            <w:tcW w:type="dxa" w:w="2351"/>
+            <w:tcW w:type="dxa" w:w="2160"/>
+            <w:shd w:val="clear" w:color="auto" w:fill="1E56A0"/>
           </w:tcPr>
           <w:p>
             <w:r>
               <w:rPr>
                 <w:b/>
-                <w:sz w:val="20"/>
+                <w:color w:val="FFFFFF"/>
               </w:rPr>
-              <w:t>#</w:t>
+              <w:t>Day / Date</w:t>
             </w:r>
           </w:p>
         </w:tc>
         <w:tc>
           <w:tcPr>
-            <w:tcW w:type="dxa" w:w="2351"/>
+            <w:tcW w:type="dxa" w:w="2160"/>
+            <w:shd w:val="clear" w:color="auto" w:fill="1E56A0"/>
           </w:tcPr>
           <w:p>
             <w:r>
               <w:rPr>
                 <w:b/>
-                <w:sz w:val="20"/>
+                <w:color w:val="FFFFFF"/>
               </w:rPr>
-              <w:t>File</w:t>
+              <w:t>Phase / Focus Area</w:t>
             </w:r>
           </w:p>
         </w:tc>
         <w:tc>
           <w:tcPr>
-            <w:tcW w:type="dxa" w:w="2351"/>
+            <w:tcW w:type="dxa" w:w="2160"/>
+            <w:shd w:val="clear" w:color="auto" w:fill="1E56A0"/>
           </w:tcPr>
           <w:p>
             <w:r>
               <w:rPr>
                 <w:b/>
-                <w:sz w:val="20"/>
+                <w:color w:val="FFFFFF"/>
               </w:rPr>
-              <w:t>Action</w:t>
+              <w:t>Key Achievements</w:t>
             </w:r>
           </w:p>
         </w:tc>
         <w:tc>
           <w:tcPr>
-            <w:tcW w:type="dxa" w:w="2351"/>
+            <w:tcW w:type="dxa" w:w="2160"/>
+            <w:shd w:val="clear" w:color="auto" w:fill="1E56A0"/>
           </w:tcPr>
           <w:p>
             <w:r>
               <w:rPr>
                 <w:b/>
-                <w:sz w:val="20"/>
+                <w:color w:val="FFFFFF"/>
               </w:rPr>
               <w:t>Status</w:t>
             </w:r>
@@ -166,53 +144,57 @@
       <w:tr>
         <w:tc>
           <w:tcPr>
-            <w:tcW w:type="dxa" w:w="2351"/>
+            <w:tcW w:type="dxa" w:w="2160"/>
           </w:tcPr>
           <w:p>
             <w:r>
               <w:rPr>
-                <w:sz w:val="20"/>
+                <w:rFonts w:ascii="Segoe UI" w:hAnsi="Segoe UI"/>
+                <w:sz w:val="19"/>
               </w:rPr>
-              <w:t>1</w:t>
+              <w:t>Day 1 (2026-07-22)</w:t>
             </w:r>
           </w:p>
         </w:tc>
         <w:tc>
           <w:tcPr>
-            <w:tcW w:type="dxa" w:w="2351"/>
+            <w:tcW w:type="dxa" w:w="2160"/>
           </w:tcPr>
           <w:p>
             <w:r>
               <w:rPr>
-                <w:sz w:val="20"/>
+                <w:rFonts w:ascii="Segoe UI" w:hAnsi="Segoe UI"/>
+                <w:sz w:val="19"/>
               </w:rPr>
-              <w:t>src/gui.py</w:t>
+              <w:t>Project Initialization</w:t>
             </w:r>
           </w:p>
         </w:tc>
         <w:tc>
           <w:tcPr>
-            <w:tcW w:type="dxa" w:w="2351"/>
+            <w:tcW w:type="dxa" w:w="2160"/>
           </w:tcPr>
           <w:p>
             <w:r>
               <w:rPr>
-                <w:sz w:val="20"/>
+                <w:rFonts w:ascii="Segoe UI" w:hAnsi="Segoe UI"/>
+                <w:sz w:val="19"/>
               </w:rPr>
-              <w:t>Bug fixes</w:t>
+              <w:t>Repo setup, README framework, core requirements.txt</w:t>
             </w:r>
           </w:p>
         </w:tc>
         <w:tc>
           <w:tcPr>
-            <w:tcW w:type="dxa" w:w="2351"/>
+            <w:tcW w:type="dxa" w:w="2160"/>
           </w:tcPr>
           <w:p>
             <w:r>
               <w:rPr>
-                <w:sz w:val="20"/>
+                <w:rFonts w:ascii="Segoe UI" w:hAnsi="Segoe UI"/>
+                <w:sz w:val="19"/>
               </w:rPr>
-              <w:t>Done</w:t>
+              <w:t>Completed</w:t>
             </w:r>
           </w:p>
         </w:tc>
@@ -220,53 +202,57 @@
       <w:tr>
         <w:tc>
           <w:tcPr>
-            <w:tcW w:type="dxa" w:w="2351"/>
+            <w:tcW w:type="dxa" w:w="2160"/>
           </w:tcPr>
           <w:p>
             <w:r>
               <w:rPr>
-                <w:sz w:val="20"/>
+                <w:rFonts w:ascii="Segoe UI" w:hAnsi="Segoe UI"/>
+                <w:sz w:val="19"/>
               </w:rPr>
-              <w:t>2</w:t>
+              <w:t>Day 2 (2026-07-26)</w:t>
             </w:r>
           </w:p>
         </w:tc>
         <w:tc>
           <w:tcPr>
-            <w:tcW w:type="dxa" w:w="2351"/>
+            <w:tcW w:type="dxa" w:w="2160"/>
           </w:tcPr>
           <w:p>
             <w:r>
               <w:rPr>
-                <w:sz w:val="20"/>
+                <w:rFonts w:ascii="Segoe UI" w:hAnsi="Segoe UI"/>
+                <w:sz w:val="19"/>
               </w:rPr>
-              <w:t>src/predict.py</w:t>
+              <w:t>Core ML Engine &amp; Prototype</w:t>
             </w:r>
           </w:p>
         </w:tc>
         <w:tc>
           <w:tcPr>
-            <w:tcW w:type="dxa" w:w="2351"/>
+            <w:tcW w:type="dxa" w:w="2160"/>
           </w:tcPr>
           <w:p>
             <w:r>
               <w:rPr>
-                <w:sz w:val="20"/>
+                <w:rFonts w:ascii="Segoe UI" w:hAnsi="Segoe UI"/>
+                <w:sz w:val="19"/>
               </w:rPr>
-              <w:t>Cleaned up &amp; restructured</w:t>
+              <w:t>Preprocessing, training, predict scripts, 100-comment test dataset</w:t>
             </w:r>
           </w:p>
         </w:tc>
         <w:tc>
           <w:tcPr>
-            <w:tcW w:type="dxa" w:w="2351"/>
+            <w:tcW w:type="dxa" w:w="2160"/>
           </w:tcPr>
           <w:p>
             <w:r>
               <w:rPr>
-                <w:sz w:val="20"/>
+                <w:rFonts w:ascii="Segoe UI" w:hAnsi="Segoe UI"/>
+                <w:sz w:val="19"/>
               </w:rPr>
-              <w:t>Done</w:t>
+              <w:t>Completed</w:t>
             </w:r>
           </w:p>
         </w:tc>
@@ -274,53 +260,57 @@
       <w:tr>
         <w:tc>
           <w:tcPr>
-            <w:tcW w:type="dxa" w:w="2351"/>
+            <w:tcW w:type="dxa" w:w="2160"/>
           </w:tcPr>
           <w:p>
             <w:r>
               <w:rPr>
-                <w:sz w:val="20"/>
+                <w:rFonts w:ascii="Segoe UI" w:hAnsi="Segoe UI"/>
+                <w:sz w:val="19"/>
               </w:rPr>
-              <w:t>3</w:t>
+              <w:t>Day 3 (2026-07-27)</w:t>
             </w:r>
           </w:p>
         </w:tc>
         <w:tc>
           <w:tcPr>
-            <w:tcW w:type="dxa" w:w="2351"/>
+            <w:tcW w:type="dxa" w:w="2160"/>
           </w:tcPr>
           <w:p>
             <w:r>
               <w:rPr>
-                <w:sz w:val="20"/>
+                <w:rFonts w:ascii="Segoe UI" w:hAnsi="Segoe UI"/>
+                <w:sz w:val="19"/>
               </w:rPr>
-              <w:t>data/comments.csv</w:t>
+              <w:t>GUI &amp; Team Contributions</w:t>
             </w:r>
           </w:p>
         </w:tc>
         <w:tc>
           <w:tcPr>
-            <w:tcW w:type="dxa" w:w="2351"/>
+            <w:tcW w:type="dxa" w:w="2160"/>
           </w:tcPr>
           <w:p>
             <w:r>
               <w:rPr>
-                <w:sz w:val="20"/>
+                <w:rFonts w:ascii="Segoe UI" w:hAnsi="Segoe UI"/>
+                <w:sz w:val="19"/>
               </w:rPr>
-              <w:t>Created (new)</w:t>
+              <w:t>GUI integration, multi-frame layout, statistics.py updates</w:t>
             </w:r>
           </w:p>
         </w:tc>
         <w:tc>
           <w:tcPr>
-            <w:tcW w:type="dxa" w:w="2351"/>
+            <w:tcW w:type="dxa" w:w="2160"/>
           </w:tcPr>
           <w:p>
             <w:r>
               <w:rPr>
-                <w:sz w:val="20"/>
+                <w:rFonts w:ascii="Segoe UI" w:hAnsi="Segoe UI"/>
+                <w:sz w:val="19"/>
               </w:rPr>
-              <w:t>Done</w:t>
+              <w:t>Completed</w:t>
             </w:r>
           </w:p>
         </w:tc>
@@ -328,53 +318,57 @@
       <w:tr>
         <w:tc>
           <w:tcPr>
-            <w:tcW w:type="dxa" w:w="2351"/>
+            <w:tcW w:type="dxa" w:w="2160"/>
           </w:tcPr>
           <w:p>
             <w:r>
               <w:rPr>
-                <w:sz w:val="20"/>
+                <w:rFonts w:ascii="Segoe UI" w:hAnsi="Segoe UI"/>
+                <w:sz w:val="19"/>
               </w:rPr>
-              <w:t>4</w:t>
+              <w:t>Day 4 (2026-07-28)</w:t>
             </w:r>
           </w:p>
         </w:tc>
         <w:tc>
           <w:tcPr>
-            <w:tcW w:type="dxa" w:w="2351"/>
+            <w:tcW w:type="dxa" w:w="2160"/>
           </w:tcPr>
           <w:p>
             <w:r>
               <w:rPr>
-                <w:sz w:val="20"/>
+                <w:rFonts w:ascii="Segoe UI" w:hAnsi="Segoe UI"/>
+                <w:sz w:val="19"/>
               </w:rPr>
-              <w:t>src/preprocessing.py</w:t>
+              <w:t>Model Upgrade &amp; 11k Dataset</w:t>
             </w:r>
           </w:p>
         </w:tc>
         <w:tc>
           <w:tcPr>
-            <w:tcW w:type="dxa" w:w="2351"/>
+            <w:tcW w:type="dxa" w:w="2160"/>
           </w:tcPr>
           <w:p>
             <w:r>
               <w:rPr>
-                <w:sz w:val="20"/>
+                <w:rFonts w:ascii="Segoe UI" w:hAnsi="Segoe UI"/>
+                <w:sz w:val="19"/>
               </w:rPr>
-              <w:t>Implemented (new)</w:t>
+              <w:t>Logistic Regression + TF-IDF, 11k dataset generation, Model Explanation doc</w:t>
             </w:r>
           </w:p>
         </w:tc>
         <w:tc>
           <w:tcPr>
-            <w:tcW w:type="dxa" w:w="2351"/>
+            <w:tcW w:type="dxa" w:w="2160"/>
           </w:tcPr>
           <w:p>
             <w:r>
               <w:rPr>
-                <w:sz w:val="20"/>
+                <w:rFonts w:ascii="Segoe UI" w:hAnsi="Segoe UI"/>
+                <w:sz w:val="19"/>
               </w:rPr>
-              <w:t>Done</w:t>
+              <w:t>Completed</w:t>
             </w:r>
           </w:p>
         </w:tc>
@@ -382,53 +376,57 @@
       <w:tr>
         <w:tc>
           <w:tcPr>
-            <w:tcW w:type="dxa" w:w="2351"/>
+            <w:tcW w:type="dxa" w:w="2160"/>
           </w:tcPr>
           <w:p>
             <w:r>
               <w:rPr>
-                <w:sz w:val="20"/>
+                <w:rFonts w:ascii="Segoe UI" w:hAnsi="Segoe UI"/>
+                <w:sz w:val="19"/>
               </w:rPr>
-              <w:t>5</w:t>
+              <w:t>Day 5 Today (2026-07-29)</w:t>
             </w:r>
           </w:p>
         </w:tc>
         <w:tc>
           <w:tcPr>
-            <w:tcW w:type="dxa" w:w="2351"/>
+            <w:tcW w:type="dxa" w:w="2160"/>
           </w:tcPr>
           <w:p>
             <w:r>
               <w:rPr>
-                <w:sz w:val="20"/>
+                <w:rFonts w:ascii="Segoe UI" w:hAnsi="Segoe UI"/>
+                <w:sz w:val="19"/>
               </w:rPr>
-              <w:t>src/train_model.py</w:t>
+              <w:t>Modular Architecture &amp; UI</w:t>
             </w:r>
           </w:p>
         </w:tc>
         <w:tc>
           <w:tcPr>
-            <w:tcW w:type="dxa" w:w="2351"/>
+            <w:tcW w:type="dxa" w:w="2160"/>
           </w:tcPr>
           <w:p>
             <w:r>
               <w:rPr>
-                <w:sz w:val="20"/>
+                <w:rFonts w:ascii="Segoe UI" w:hAnsi="Segoe UI"/>
+                <w:sz w:val="19"/>
               </w:rPr>
-              <w:t>Implemented (new)</w:t>
+              <w:t>Clean src package structure, Tkinter dashboard, file/git cleanup</w:t>
             </w:r>
           </w:p>
         </w:tc>
         <w:tc>
           <w:tcPr>
-            <w:tcW w:type="dxa" w:w="2351"/>
+            <w:tcW w:type="dxa" w:w="2160"/>
           </w:tcPr>
           <w:p>
             <w:r>
               <w:rPr>
-                <w:sz w:val="20"/>
+                <w:rFonts w:ascii="Segoe UI" w:hAnsi="Segoe UI"/>
+                <w:sz w:val="19"/>
               </w:rPr>
-              <w:t>Done</w:t>
+              <w:t>Completed</w:t>
             </w:r>
           </w:p>
         </w:tc>
@@ -436,107 +434,57 @@
       <w:tr>
         <w:tc>
           <w:tcPr>
-            <w:tcW w:type="dxa" w:w="2351"/>
+            <w:tcW w:type="dxa" w:w="2160"/>
           </w:tcPr>
           <w:p>
             <w:r>
               <w:rPr>
-                <w:sz w:val="20"/>
+                <w:rFonts w:ascii="Segoe UI" w:hAnsi="Segoe UI"/>
+                <w:sz w:val="19"/>
               </w:rPr>
-              <w:t>6</w:t>
+              <w:t>Day 6 Tomorrow (2026-07-30+)</w:t>
             </w:r>
           </w:p>
         </w:tc>
         <w:tc>
           <w:tcPr>
-            <w:tcW w:type="dxa" w:w="2351"/>
+            <w:tcW w:type="dxa" w:w="2160"/>
           </w:tcPr>
           <w:p>
             <w:r>
               <w:rPr>
-                <w:sz w:val="20"/>
+                <w:rFonts w:ascii="Segoe UI" w:hAnsi="Segoe UI"/>
+                <w:sz w:val="19"/>
               </w:rPr>
-              <w:t>requirements.txt</w:t>
+              <w:t>Production &amp; Standalone Executable</w:t>
             </w:r>
           </w:p>
         </w:tc>
         <w:tc>
           <w:tcPr>
-            <w:tcW w:type="dxa" w:w="2351"/>
+            <w:tcW w:type="dxa" w:w="2160"/>
           </w:tcPr>
           <w:p>
             <w:r>
               <w:rPr>
-                <w:sz w:val="20"/>
+                <w:rFonts w:ascii="Segoe UI" w:hAnsi="Segoe UI"/>
+                <w:sz w:val="19"/>
               </w:rPr>
-              <w:t>Created (new)</w:t>
+              <w:t>Export functions, single-comment live predictor, PyInstaller .exe build</w:t>
             </w:r>
           </w:p>
         </w:tc>
         <w:tc>
           <w:tcPr>
-            <w:tcW w:type="dxa" w:w="2351"/>
+            <w:tcW w:type="dxa" w:w="2160"/>
           </w:tcPr>
           <w:p>
             <w:r>
               <w:rPr>
-                <w:sz w:val="20"/>
+                <w:rFonts w:ascii="Segoe UI" w:hAnsi="Segoe UI"/>
+                <w:sz w:val="19"/>
               </w:rPr>
-              <w:t>Done</w:t>
-            </w:r>
-          </w:p>
-        </w:tc>
-      </w:tr>
-      <w:tr>
-        <w:tc>
-          <w:tcPr>
-            <w:tcW w:type="dxa" w:w="2351"/>
-          </w:tcPr>
-          <w:p>
-            <w:r>
-              <w:rPr>
-                <w:sz w:val="20"/>
-              </w:rPr>
-              <w:t>7</w:t>
-            </w:r>
-          </w:p>
-        </w:tc>
-        <w:tc>
-          <w:tcPr>
-            <w:tcW w:type="dxa" w:w="2351"/>
-          </w:tcPr>
-          <w:p>
-            <w:r>
-              <w:rPr>
-                <w:sz w:val="20"/>
-              </w:rPr>
-              <w:t>REQUIRMENTS.TXT</w:t>
-            </w:r>
-          </w:p>
-        </w:tc>
-        <w:tc>
-          <w:tcPr>
-            <w:tcW w:type="dxa" w:w="2351"/>
-          </w:tcPr>
-          <w:p>
-            <w:r>
-              <w:rPr>
-                <w:sz w:val="20"/>
-              </w:rPr>
-              <w:t>Deleted (misspelled)</w:t>
-            </w:r>
-          </w:p>
-        </w:tc>
-        <w:tc>
-          <w:tcPr>
-            <w:tcW w:type="dxa" w:w="2351"/>
-          </w:tcPr>
-          <w:p>
-            <w:r>
-              <w:rPr>
-                <w:sz w:val="20"/>
-              </w:rPr>
-              <w:t>Done</w:t>
+              <w:t>Planned</w:t>
             </w:r>
           </w:p>
         </w:tc>
@@ -549,304 +497,82 @@
       </w:pPr>
       <w:r>
         <w:rPr>
-          <w:color w:val="003366"/>
+          <w:b/>
+          <w:color w:val="1E56A0"/>
+          <w:sz w:val="32"/>
         </w:rPr>
-        <w:t>2. gui.py — Bug Fixes</w:t>
+        <w:t>2. Day 1 (2026-07-22): Project Initialization</w:t>
+      </w:r>
+    </w:p>
+    <w:p>
+      <w:r>
+        <w:rPr>
+          <w:rFonts w:ascii="Segoe UI" w:hAnsi="Segoe UI"/>
+          <w:b w:val="0"/>
+          <w:i w:val="0"/>
+          <w:sz w:val="21"/>
+        </w:rPr>
+        <w:t>On Day 1, the foundational repository environment was established to support machine learning and data processing workflows.</w:t>
       </w:r>
     </w:p>
     <w:p>
       <w:pPr>
-        <w:spacing w:after="120"/>
-      </w:pPr>
-      <w:r>
-        <w:t>The original gui.py had several critical bugs that would cause the application to crash. The following issues were identified and fixed:</w:t>
-      </w:r>
-    </w:p>
-    <w:tbl>
-      <w:tblPr>
-        <w:tblStyle w:val="LightGrid-Accent1"/>
-        <w:tblW w:type="auto" w:w="0"/>
-        <w:jc w:val="center"/>
-        <w:tblLook w:firstColumn="1" w:firstRow="1" w:lastColumn="0" w:lastRow="0" w:noHBand="0" w:noVBand="1" w:val="04A0"/>
-      </w:tblPr>
-      <w:tblGrid>
-        <w:gridCol w:w="4703"/>
-        <w:gridCol w:w="4703"/>
-      </w:tblGrid>
-      <w:tr>
-        <w:tc>
-          <w:tcPr>
-            <w:tcW w:type="dxa" w:w="4703"/>
-          </w:tcPr>
-          <w:p>
-            <w:r>
-              <w:rPr>
-                <w:b/>
-                <w:sz w:val="20"/>
-              </w:rPr>
-              <w:t>Bug</w:t>
-            </w:r>
-          </w:p>
-        </w:tc>
-        <w:tc>
-          <w:tcPr>
-            <w:tcW w:type="dxa" w:w="4703"/>
-          </w:tcPr>
-          <w:p>
-            <w:r>
-              <w:rPr>
-                <w:b/>
-                <w:sz w:val="20"/>
-              </w:rPr>
-              <w:t>Fix</w:t>
-            </w:r>
-          </w:p>
-        </w:tc>
-      </w:tr>
-      <w:tr>
-        <w:tc>
-          <w:tcPr>
-            <w:tcW w:type="dxa" w:w="4703"/>
-          </w:tcPr>
-          <w:p>
-            <w:r>
-              <w:rPr>
-                <w:sz w:val="20"/>
-              </w:rPr>
-              <w:t>Code ran outside if/else block — crashed on cancel</w:t>
-            </w:r>
-          </w:p>
-        </w:tc>
-        <w:tc>
-          <w:tcPr>
-            <w:tcW w:type="dxa" w:w="4703"/>
-          </w:tcPr>
-          <w:p>
-            <w:r>
-              <w:rPr>
-                <w:sz w:val="20"/>
-              </w:rPr>
-              <w:t>Moved all file-reading logic inside "if file_path:" block</w:t>
-            </w:r>
-          </w:p>
-        </w:tc>
-      </w:tr>
-      <w:tr>
-        <w:tc>
-          <w:tcPr>
-            <w:tcW w:type="dxa" w:w="4703"/>
-          </w:tcPr>
-          <w:p>
-            <w:r>
-              <w:rPr>
-                <w:sz w:val="20"/>
-              </w:rPr>
-              <w:t>Hardcoded "data.csv" ignored the selected file</w:t>
-            </w:r>
-          </w:p>
-        </w:tc>
-        <w:tc>
-          <w:tcPr>
-            <w:tcW w:type="dxa" w:w="4703"/>
-          </w:tcPr>
-          <w:p>
-            <w:r>
-              <w:rPr>
-                <w:sz w:val="20"/>
-              </w:rPr>
-              <w:t>Now uses the actual file_path from the file dialog</w:t>
-            </w:r>
-          </w:p>
-        </w:tc>
-      </w:tr>
-      <w:tr>
-        <w:tc>
-          <w:tcPr>
-            <w:tcW w:type="dxa" w:w="4703"/>
-          </w:tcPr>
-          <w:p>
-            <w:r>
-              <w:rPr>
-                <w:sz w:val="20"/>
-              </w:rPr>
-              <w:t>Hardcoded "comment" column name</w:t>
-            </w:r>
-          </w:p>
-        </w:tc>
-        <w:tc>
-          <w:tcPr>
-            <w:tcW w:type="dxa" w:w="4703"/>
-          </w:tcPr>
-          <w:p>
-            <w:r>
-              <w:rPr>
-                <w:sz w:val="20"/>
-              </w:rPr>
-              <w:t>Removed — loads and displays the full DataFrame</w:t>
-            </w:r>
-          </w:p>
-        </w:tc>
-      </w:tr>
-      <w:tr>
-        <w:tc>
-          <w:tcPr>
-            <w:tcW w:type="dxa" w:w="4703"/>
-          </w:tcPr>
-          <w:p>
-            <w:r>
-              <w:rPr>
-                <w:sz w:val="20"/>
-              </w:rPr>
-              <w:t>No error handling</w:t>
-            </w:r>
-          </w:p>
-        </w:tc>
-        <w:tc>
-          <w:tcPr>
-            <w:tcW w:type="dxa" w:w="4703"/>
-          </w:tcPr>
-          <w:p>
-            <w:r>
-              <w:rPr>
-                <w:sz w:val="20"/>
-              </w:rPr>
-              <w:t>Added try/except around file reading</w:t>
-            </w:r>
-          </w:p>
-        </w:tc>
-      </w:tr>
-      <w:tr>
-        <w:tc>
-          <w:tcPr>
-            <w:tcW w:type="dxa" w:w="4703"/>
-          </w:tcPr>
-          <w:p>
-            <w:r>
-              <w:rPr>
-                <w:sz w:val="20"/>
-              </w:rPr>
-              <w:t>Window title said "CSV Uploader"</w:t>
-            </w:r>
-          </w:p>
-        </w:tc>
-        <w:tc>
-          <w:tcPr>
-            <w:tcW w:type="dxa" w:w="4703"/>
-          </w:tcPr>
-          <w:p>
-            <w:r>
-              <w:rPr>
-                <w:sz w:val="20"/>
-              </w:rPr>
-              <w:t>Changed to "Social Media Sentiment Analyzer"</w:t>
-            </w:r>
-          </w:p>
-        </w:tc>
-      </w:tr>
-      <w:tr>
-        <w:tc>
-          <w:tcPr>
-            <w:tcW w:type="dxa" w:w="4703"/>
-          </w:tcPr>
-          <w:p>
-            <w:r>
-              <w:rPr>
-                <w:sz w:val="20"/>
-              </w:rPr>
-              <w:t>initialfile="data.csv" in dialog</w:t>
-            </w:r>
-          </w:p>
-        </w:tc>
-        <w:tc>
-          <w:tcPr>
-            <w:tcW w:type="dxa" w:w="4703"/>
-          </w:tcPr>
-          <w:p>
-            <w:r>
-              <w:rPr>
-                <w:sz w:val="20"/>
-              </w:rPr>
-              <w:t>Removed — lets the user pick freely</w:t>
-            </w:r>
-          </w:p>
-        </w:tc>
-      </w:tr>
-    </w:tbl>
-    <w:p/>
-    <w:p>
-      <w:pPr>
-        <w:pStyle w:val="Heading2"/>
+        <w:pStyle w:val="ListBullet"/>
       </w:pPr>
       <w:r>
         <w:rPr>
-          <w:color w:val="003366"/>
+          <w:rFonts w:ascii="Segoe UI" w:hAnsi="Segoe UI"/>
+          <w:b/>
+          <w:sz w:val="20"/>
         </w:rPr>
-        <w:t>Before (Buggy Code)</w:t>
+        <w:t xml:space="preserve">Git Repository Setup: </w:t>
+      </w:r>
+      <w:r>
+        <w:rPr>
+          <w:rFonts w:ascii="Segoe UI" w:hAnsi="Segoe UI"/>
+          <w:sz w:val="20"/>
+        </w:rPr>
+        <w:t>Created initial repository structure and initialized git version control.</w:t>
       </w:r>
     </w:p>
     <w:p>
       <w:pPr>
-        <w:spacing w:before="80" w:after="80"/>
+        <w:pStyle w:val="ListBullet"/>
       </w:pPr>
       <w:r>
         <w:rPr>
-          <w:rFonts w:ascii="Consolas" w:hAnsi="Consolas"/>
-          <w:color w:val="1E1E1E"/>
-          <w:sz w:val="18"/>
+          <w:rFonts w:ascii="Segoe UI" w:hAnsi="Segoe UI"/>
+          <w:b/>
+          <w:sz w:val="20"/>
         </w:rPr>
-        <w:t># Lines 32-35 ran OUTSIDE the if/else block</w:t>
-        <w:br/>
-        <w:t>filename = os.path.basename(file_path)    # crashes if cancelled</w:t>
-        <w:br/>
-        <w:t>df = pd.read_csv("data.csv")              # hardcoded path</w:t>
-        <w:br/>
-        <w:t>filtered_df = df[["comment"]]             # hardcoded column</w:t>
-        <w:br/>
-        <w:t>print(filtered_df)</w:t>
+        <w:t xml:space="preserve">Environment &amp; Dependencies: </w:t>
+      </w:r>
+      <w:r>
+        <w:rPr>
+          <w:rFonts w:ascii="Segoe UI" w:hAnsi="Segoe UI"/>
+          <w:sz w:val="20"/>
+        </w:rPr>
+        <w:t>Configured requirements.txt defining essential libraries: pandas, scikit-learn, nltk, joblib, matplotlib.</w:t>
       </w:r>
     </w:p>
     <w:p>
       <w:pPr>
-        <w:pStyle w:val="Heading2"/>
+        <w:pStyle w:val="ListBullet"/>
       </w:pPr>
       <w:r>
         <w:rPr>
-          <w:color w:val="003366"/>
+          <w:rFonts w:ascii="Segoe UI" w:hAnsi="Segoe UI"/>
+          <w:b/>
+          <w:sz w:val="20"/>
         </w:rPr>
-        <w:t>After (Fixed Code)</w:t>
+        <w:t xml:space="preserve">Initial Documentation: </w:t>
       </w:r>
-    </w:p>
-    <w:p>
-      <w:pPr>
-        <w:spacing w:before="80" w:after="80"/>
-      </w:pPr>
       <w:r>
         <w:rPr>
-          <w:rFonts w:ascii="Consolas" w:hAnsi="Consolas"/>
-          <w:color w:val="1E1E1E"/>
-          <w:sz w:val="18"/>
+          <w:rFonts w:ascii="Segoe UI" w:hAnsi="Segoe UI"/>
+          <w:sz w:val="20"/>
         </w:rPr>
-        <w:t>if file_path:</w:t>
-        <w:br/>
-        <w:t xml:space="preserve">    filename = os.path.basename(file_path)</w:t>
-        <w:br/>
-        <w:t xml:space="preserve">    status_label.config(text=f"Uploaded: {filename}", fg="green")</w:t>
-        <w:br/>
-        <w:t xml:space="preserve">    try:</w:t>
-        <w:br/>
-        <w:t xml:space="preserve">        df = pd.read_csv(file_path)    # uses actual selected path</w:t>
-        <w:br/>
-        <w:t xml:space="preserve">        print(f"Dataset loaded successfully!")</w:t>
-        <w:br/>
-        <w:t xml:space="preserve">        print(f"Total rows: {len(df)}")</w:t>
-        <w:br/>
-        <w:t xml:space="preserve">    except Exception as e:</w:t>
-        <w:br/>
-        <w:t xml:space="preserve">        status_label.config(text=f"Error: {e}", fg="red")</w:t>
-        <w:br/>
-        <w:t>else:</w:t>
-        <w:br/>
-        <w:t xml:space="preserve">    status_label.config(text="Upload cancelled.", fg="red")</w:t>
+        <w:t>Drafted base README outlining project objectives and planned architecture.</w:t>
       </w:r>
     </w:p>
     <w:p>
@@ -855,174 +581,22 @@
       </w:pPr>
       <w:r>
         <w:rPr>
-          <w:color w:val="003366"/>
+          <w:b/>
+          <w:color w:val="1E56A0"/>
+          <w:sz w:val="32"/>
         </w:rPr>
-        <w:t>3. predict.py — Cleanup &amp; Restructure</w:t>
+        <w:t>3. Day 2 (2026-07-26): Core ML Engine &amp; Prototype</w:t>
       </w:r>
     </w:p>
     <w:p>
-      <w:pPr>
-        <w:pStyle w:val="Heading2"/>
-      </w:pPr>
       <w:r>
         <w:rPr>
-          <w:color w:val="003366"/>
+          <w:rFonts w:ascii="Segoe UI" w:hAnsi="Segoe UI"/>
+          <w:b w:val="0"/>
+          <w:i w:val="0"/>
+          <w:sz w:val="21"/>
         </w:rPr>
-        <w:t>What Changed</w:t>
-      </w:r>
-    </w:p>
-    <w:p>
-      <w:pPr>
-        <w:spacing w:after="120"/>
-      </w:pPr>
-      <w:r>
-        <w:t>Before: A flat script that ran everything at module level, used TextBlob (a lexicon-based tool, not ML), duplicated preprocessing code, and hardcoded "data.csv".</w:t>
-      </w:r>
-    </w:p>
-    <w:p>
-      <w:pPr>
-        <w:spacing w:after="120"/>
-      </w:pPr>
-      <w:r>
-        <w:t>After: A clean, function-based module with 3 reusable functions that uses the trained ML model.</w:t>
-      </w:r>
-    </w:p>
-    <w:tbl>
-      <w:tblPr>
-        <w:tblStyle w:val="LightGrid-Accent1"/>
-        <w:tblW w:type="auto" w:w="0"/>
-        <w:jc w:val="center"/>
-        <w:tblLook w:firstColumn="1" w:firstRow="1" w:lastColumn="0" w:lastRow="0" w:noHBand="0" w:noVBand="1" w:val="04A0"/>
-      </w:tblPr>
-      <w:tblGrid>
-        <w:gridCol w:w="4703"/>
-        <w:gridCol w:w="4703"/>
-      </w:tblGrid>
-      <w:tr>
-        <w:tc>
-          <w:tcPr>
-            <w:tcW w:type="dxa" w:w="4703"/>
-          </w:tcPr>
-          <w:p>
-            <w:r>
-              <w:rPr>
-                <w:b/>
-                <w:sz w:val="20"/>
-              </w:rPr>
-              <w:t>Function</w:t>
-            </w:r>
-          </w:p>
-        </w:tc>
-        <w:tc>
-          <w:tcPr>
-            <w:tcW w:type="dxa" w:w="4703"/>
-          </w:tcPr>
-          <w:p>
-            <w:r>
-              <w:rPr>
-                <w:b/>
-                <w:sz w:val="20"/>
-              </w:rPr>
-              <w:t>Purpose</w:t>
-            </w:r>
-          </w:p>
-        </w:tc>
-      </w:tr>
-      <w:tr>
-        <w:tc>
-          <w:tcPr>
-            <w:tcW w:type="dxa" w:w="4703"/>
-          </w:tcPr>
-          <w:p>
-            <w:r>
-              <w:rPr>
-                <w:sz w:val="20"/>
-              </w:rPr>
-              <w:t>load_model()</w:t>
-            </w:r>
-          </w:p>
-        </w:tc>
-        <w:tc>
-          <w:tcPr>
-            <w:tcW w:type="dxa" w:w="4703"/>
-          </w:tcPr>
-          <w:p>
-            <w:r>
-              <w:rPr>
-                <w:sz w:val="20"/>
-              </w:rPr>
-              <w:t>Loads model.pkl and vectorizer.pkl from the models/ folder</w:t>
-            </w:r>
-          </w:p>
-        </w:tc>
-      </w:tr>
-      <w:tr>
-        <w:tc>
-          <w:tcPr>
-            <w:tcW w:type="dxa" w:w="4703"/>
-          </w:tcPr>
-          <w:p>
-            <w:r>
-              <w:rPr>
-                <w:sz w:val="20"/>
-              </w:rPr>
-              <w:t>predict_sentiment(text, model, vectorizer)</w:t>
-            </w:r>
-          </w:p>
-        </w:tc>
-        <w:tc>
-          <w:tcPr>
-            <w:tcW w:type="dxa" w:w="4703"/>
-          </w:tcPr>
-          <w:p>
-            <w:r>
-              <w:rPr>
-                <w:sz w:val="20"/>
-              </w:rPr>
-              <w:t>Predicts sentiment for a single comment</w:t>
-            </w:r>
-          </w:p>
-        </w:tc>
-      </w:tr>
-      <w:tr>
-        <w:tc>
-          <w:tcPr>
-            <w:tcW w:type="dxa" w:w="4703"/>
-          </w:tcPr>
-          <w:p>
-            <w:r>
-              <w:rPr>
-                <w:sz w:val="20"/>
-              </w:rPr>
-              <w:t>predict_from_csv(file_path, model, vectorizer)</w:t>
-            </w:r>
-          </w:p>
-        </w:tc>
-        <w:tc>
-          <w:tcPr>
-            <w:tcW w:type="dxa" w:w="4703"/>
-          </w:tcPr>
-          <w:p>
-            <w:r>
-              <w:rPr>
-                <w:sz w:val="20"/>
-              </w:rPr>
-              <w:t>Predicts sentiments for all comments in a CSV file</w:t>
-            </w:r>
-          </w:p>
-        </w:tc>
-      </w:tr>
-    </w:tbl>
-    <w:p/>
-    <w:p>
-      <w:pPr>
-        <w:pStyle w:val="Heading2"/>
-      </w:pPr>
-      <w:r>
-        <w:rPr>
-          <w:color w:val="003366"/>
-        </w:rPr>
-        <w:t>Key Improvements</w:t>
+        <w:t>Day 2 focused on constructing the underlying NLP data pipeline and initial batch test data.</w:t>
       </w:r>
     </w:p>
     <w:p>
@@ -1030,7 +604,19 @@
         <w:pStyle w:val="ListBullet"/>
       </w:pPr>
       <w:r>
-        <w:t>Uses the trained ML model instead of TextBlob (rule-based)</w:t>
+        <w:rPr>
+          <w:rFonts w:ascii="Segoe UI" w:hAnsi="Segoe UI"/>
+          <w:b/>
+          <w:sz w:val="20"/>
+        </w:rPr>
+        <w:t xml:space="preserve">Preprocessing Module: </w:t>
+      </w:r>
+      <w:r>
+        <w:rPr>
+          <w:rFonts w:ascii="Segoe UI" w:hAnsi="Segoe UI"/>
+          <w:sz w:val="20"/>
+        </w:rPr>
+        <w:t>Built text normalization functions using regex for URL and punctuation stripping, plus NLTK stop-word removal.</w:t>
       </w:r>
     </w:p>
     <w:p>
@@ -1038,7 +624,19 @@
         <w:pStyle w:val="ListBullet"/>
       </w:pPr>
       <w:r>
-        <w:t>Imports preprocess_text from preprocessing.py — no code duplication</w:t>
+        <w:rPr>
+          <w:rFonts w:ascii="Segoe UI" w:hAnsi="Segoe UI"/>
+          <w:b/>
+          <w:sz w:val="20"/>
+        </w:rPr>
+        <w:t xml:space="preserve">Model Training &amp; Inference: </w:t>
+      </w:r>
+      <w:r>
+        <w:rPr>
+          <w:rFonts w:ascii="Segoe UI" w:hAnsi="Segoe UI"/>
+          <w:sz w:val="20"/>
+        </w:rPr>
+        <w:t>Developed standalone training script (train_model.py) and inference script (predict.py).</w:t>
       </w:r>
     </w:p>
     <w:p>
@@ -1046,7 +644,19 @@
         <w:pStyle w:val="ListBullet"/>
       </w:pPr>
       <w:r>
-        <w:t>Has an if __name__ == "__main__" guard so it doesn't auto-run when imported</w:t>
+        <w:rPr>
+          <w:rFonts w:ascii="Segoe UI" w:hAnsi="Segoe UI"/>
+          <w:b/>
+          <w:sz w:val="20"/>
+        </w:rPr>
+        <w:t xml:space="preserve">Test Dataset Creation: </w:t>
+      </w:r>
+      <w:r>
+        <w:rPr>
+          <w:rFonts w:ascii="Segoe UI" w:hAnsi="Segoe UI"/>
+          <w:sz w:val="20"/>
+        </w:rPr>
+        <w:t>Generated test_100_comments.csv containing 100 sample social media comments for verification.</w:t>
       </w:r>
     </w:p>
     <w:p>
@@ -1054,38 +664,39 @@
         <w:pStyle w:val="ListBullet"/>
       </w:pPr>
       <w:r>
-        <w:t>Error checking for missing model files</w:t>
+        <w:rPr>
+          <w:rFonts w:ascii="Segoe UI" w:hAnsi="Segoe UI"/>
+          <w:b/>
+          <w:sz w:val="20"/>
+        </w:rPr>
+        <w:t xml:space="preserve">Teamwork Guide: </w:t>
+      </w:r>
+      <w:r>
+        <w:rPr>
+          <w:rFonts w:ascii="Segoe UI" w:hAnsi="Segoe UI"/>
+          <w:sz w:val="20"/>
+        </w:rPr>
+        <w:t>Created Pending_Work_Team_Guide.docx detailing sub-task breakdowns for team contributors.</w:t>
       </w:r>
     </w:p>
     <w:p>
       <w:pPr>
-        <w:pStyle w:val="Heading2"/>
+        <w:pStyle w:val="ListBullet"/>
       </w:pPr>
       <w:r>
         <w:rPr>
-          <w:color w:val="003366"/>
+          <w:rFonts w:ascii="Segoe UI" w:hAnsi="Segoe UI"/>
+          <w:b/>
+          <w:sz w:val="20"/>
         </w:rPr>
-        <w:t>Test Results</w:t>
+        <w:t xml:space="preserve">Analytics Module: </w:t>
       </w:r>
-    </w:p>
-    <w:p>
-      <w:pPr>
-        <w:spacing w:before="80" w:after="80"/>
-      </w:pPr>
       <w:r>
         <w:rPr>
-          <w:rFonts w:ascii="Consolas" w:hAnsi="Consolas"/>
-          <w:color w:val="1E1E1E"/>
-          <w:sz w:val="18"/>
+          <w:rFonts w:ascii="Segoe UI" w:hAnsi="Segoe UI"/>
+          <w:sz w:val="20"/>
         </w:rPr>
-        <w:t>Comment: I really enjoyed the movie, it was fantastic!</w:t>
-        <w:br/>
-        <w:t>Predicted Sentiment: Positive</w:t>
-        <w:br/>
-        <w:br/>
-        <w:t>Comment: Terrible experience, worst product ever</w:t>
-        <w:br/>
-        <w:t>Predicted Sentiment: Negative</w:t>
+        <w:t>Integrated statistics.py contributed by team member manvi-afk for frequency distribution tables.</w:t>
       </w:r>
     </w:p>
     <w:p>
@@ -1094,485 +705,22 @@
       </w:pPr>
       <w:r>
         <w:rPr>
-          <w:color w:val="003366"/>
+          <w:b/>
+          <w:color w:val="1E56A0"/>
+          <w:sz w:val="32"/>
         </w:rPr>
-        <w:t>4. data/comments.csv — New Dataset</w:t>
+        <w:t>4. Day 3 (2026-07-27): GUI Integration &amp; Collaboration</w:t>
       </w:r>
     </w:p>
     <w:p>
-      <w:pPr>
-        <w:pStyle w:val="ListBullet"/>
-      </w:pPr>
-      <w:r>
-        <w:t>60 labeled comments (20 Positive, 20 Negative, 20 Neutral)</w:t>
-      </w:r>
-    </w:p>
-    <w:p>
-      <w:pPr>
-        <w:pStyle w:val="ListBullet"/>
-      </w:pPr>
-      <w:r>
-        <w:t>Columns: ID, comment, sentiment</w:t>
-      </w:r>
-    </w:p>
-    <w:p>
-      <w:pPr>
-        <w:pStyle w:val="ListBullet"/>
-      </w:pPr>
-      <w:r>
-        <w:t>Realistic social media comments (product reviews, customer service feedback, etc.)</w:t>
-      </w:r>
-    </w:p>
-    <w:p>
-      <w:pPr>
-        <w:pStyle w:val="ListBullet"/>
-      </w:pPr>
-      <w:r>
-        <w:t>Balanced dataset — equal number of each sentiment class</w:t>
-      </w:r>
-    </w:p>
-    <w:p>
-      <w:pPr>
-        <w:pStyle w:val="Heading2"/>
-      </w:pPr>
       <w:r>
         <w:rPr>
-          <w:color w:val="003366"/>
+          <w:rFonts w:ascii="Segoe UI" w:hAnsi="Segoe UI"/>
+          <w:b w:val="0"/>
+          <w:i w:val="0"/>
+          <w:sz w:val="21"/>
         </w:rPr>
-        <w:t>Sample Rows</w:t>
-      </w:r>
-    </w:p>
-    <w:tbl>
-      <w:tblPr>
-        <w:tblStyle w:val="LightGrid-Accent1"/>
-        <w:tblW w:type="auto" w:w="0"/>
-        <w:jc w:val="center"/>
-        <w:tblLook w:firstColumn="1" w:firstRow="1" w:lastColumn="0" w:lastRow="0" w:noHBand="0" w:noVBand="1" w:val="04A0"/>
-      </w:tblPr>
-      <w:tblGrid>
-        <w:gridCol w:w="3135"/>
-        <w:gridCol w:w="3135"/>
-        <w:gridCol w:w="3135"/>
-      </w:tblGrid>
-      <w:tr>
-        <w:tc>
-          <w:tcPr>
-            <w:tcW w:type="dxa" w:w="3135"/>
-          </w:tcPr>
-          <w:p>
-            <w:r>
-              <w:rPr>
-                <w:b/>
-                <w:sz w:val="20"/>
-              </w:rPr>
-              <w:t>ID</w:t>
-            </w:r>
-          </w:p>
-        </w:tc>
-        <w:tc>
-          <w:tcPr>
-            <w:tcW w:type="dxa" w:w="3135"/>
-          </w:tcPr>
-          <w:p>
-            <w:r>
-              <w:rPr>
-                <w:b/>
-                <w:sz w:val="20"/>
-              </w:rPr>
-              <w:t>Comment</w:t>
-            </w:r>
-          </w:p>
-        </w:tc>
-        <w:tc>
-          <w:tcPr>
-            <w:tcW w:type="dxa" w:w="3135"/>
-          </w:tcPr>
-          <w:p>
-            <w:r>
-              <w:rPr>
-                <w:b/>
-                <w:sz w:val="20"/>
-              </w:rPr>
-              <w:t>Sentiment</w:t>
-            </w:r>
-          </w:p>
-        </w:tc>
-      </w:tr>
-      <w:tr>
-        <w:tc>
-          <w:tcPr>
-            <w:tcW w:type="dxa" w:w="3135"/>
-          </w:tcPr>
-          <w:p>
-            <w:r>
-              <w:rPr>
-                <w:sz w:val="20"/>
-              </w:rPr>
-              <w:t>1</w:t>
-            </w:r>
-          </w:p>
-        </w:tc>
-        <w:tc>
-          <w:tcPr>
-            <w:tcW w:type="dxa" w:w="3135"/>
-          </w:tcPr>
-          <w:p>
-            <w:r>
-              <w:rPr>
-                <w:sz w:val="20"/>
-              </w:rPr>
-              <w:t>I absolutely love this product it is amazing</w:t>
-            </w:r>
-          </w:p>
-        </w:tc>
-        <w:tc>
-          <w:tcPr>
-            <w:tcW w:type="dxa" w:w="3135"/>
-          </w:tcPr>
-          <w:p>
-            <w:r>
-              <w:rPr>
-                <w:sz w:val="20"/>
-              </w:rPr>
-              <w:t>Positive</w:t>
-            </w:r>
-          </w:p>
-        </w:tc>
-      </w:tr>
-      <w:tr>
-        <w:tc>
-          <w:tcPr>
-            <w:tcW w:type="dxa" w:w="3135"/>
-          </w:tcPr>
-          <w:p>
-            <w:r>
-              <w:rPr>
-                <w:sz w:val="20"/>
-              </w:rPr>
-              <w:t>2</w:t>
-            </w:r>
-          </w:p>
-        </w:tc>
-        <w:tc>
-          <w:tcPr>
-            <w:tcW w:type="dxa" w:w="3135"/>
-          </w:tcPr>
-          <w:p>
-            <w:r>
-              <w:rPr>
-                <w:sz w:val="20"/>
-              </w:rPr>
-              <w:t>Worst service ever I am so disappointed</w:t>
-            </w:r>
-          </w:p>
-        </w:tc>
-        <w:tc>
-          <w:tcPr>
-            <w:tcW w:type="dxa" w:w="3135"/>
-          </w:tcPr>
-          <w:p>
-            <w:r>
-              <w:rPr>
-                <w:sz w:val="20"/>
-              </w:rPr>
-              <w:t>Negative</w:t>
-            </w:r>
-          </w:p>
-        </w:tc>
-      </w:tr>
-      <w:tr>
-        <w:tc>
-          <w:tcPr>
-            <w:tcW w:type="dxa" w:w="3135"/>
-          </w:tcPr>
-          <w:p>
-            <w:r>
-              <w:rPr>
-                <w:sz w:val="20"/>
-              </w:rPr>
-              <w:t>3</w:t>
-            </w:r>
-          </w:p>
-        </w:tc>
-        <w:tc>
-          <w:tcPr>
-            <w:tcW w:type="dxa" w:w="3135"/>
-          </w:tcPr>
-          <w:p>
-            <w:r>
-              <w:rPr>
-                <w:sz w:val="20"/>
-              </w:rPr>
-              <w:t>The delivery was on time nothing special</w:t>
-            </w:r>
-          </w:p>
-        </w:tc>
-        <w:tc>
-          <w:tcPr>
-            <w:tcW w:type="dxa" w:w="3135"/>
-          </w:tcPr>
-          <w:p>
-            <w:r>
-              <w:rPr>
-                <w:sz w:val="20"/>
-              </w:rPr>
-              <w:t>Neutral</w:t>
-            </w:r>
-          </w:p>
-        </w:tc>
-      </w:tr>
-      <w:tr>
-        <w:tc>
-          <w:tcPr>
-            <w:tcW w:type="dxa" w:w="3135"/>
-          </w:tcPr>
-          <w:p>
-            <w:r>
-              <w:rPr>
-                <w:sz w:val="20"/>
-              </w:rPr>
-              <w:t>4</w:t>
-            </w:r>
-          </w:p>
-        </w:tc>
-        <w:tc>
-          <w:tcPr>
-            <w:tcW w:type="dxa" w:w="3135"/>
-          </w:tcPr>
-          <w:p>
-            <w:r>
-              <w:rPr>
-                <w:sz w:val="20"/>
-              </w:rPr>
-              <w:t>This is the best purchase I have made in years</w:t>
-            </w:r>
-          </w:p>
-        </w:tc>
-        <w:tc>
-          <w:tcPr>
-            <w:tcW w:type="dxa" w:w="3135"/>
-          </w:tcPr>
-          <w:p>
-            <w:r>
-              <w:rPr>
-                <w:sz w:val="20"/>
-              </w:rPr>
-              <w:t>Positive</w:t>
-            </w:r>
-          </w:p>
-        </w:tc>
-      </w:tr>
-      <w:tr>
-        <w:tc>
-          <w:tcPr>
-            <w:tcW w:type="dxa" w:w="3135"/>
-          </w:tcPr>
-          <w:p>
-            <w:r>
-              <w:rPr>
-                <w:sz w:val="20"/>
-              </w:rPr>
-              <w:t>5</w:t>
-            </w:r>
-          </w:p>
-        </w:tc>
-        <w:tc>
-          <w:tcPr>
-            <w:tcW w:type="dxa" w:w="3135"/>
-          </w:tcPr>
-          <w:p>
-            <w:r>
-              <w:rPr>
-                <w:sz w:val="20"/>
-              </w:rPr>
-              <w:t>Terrible quality the product broke in two days</w:t>
-            </w:r>
-          </w:p>
-        </w:tc>
-        <w:tc>
-          <w:tcPr>
-            <w:tcW w:type="dxa" w:w="3135"/>
-          </w:tcPr>
-          <w:p>
-            <w:r>
-              <w:rPr>
-                <w:sz w:val="20"/>
-              </w:rPr>
-              <w:t>Negative</w:t>
-            </w:r>
-          </w:p>
-        </w:tc>
-      </w:tr>
-    </w:tbl>
-    <w:p/>
-    <w:p>
-      <w:pPr>
-        <w:pStyle w:val="Heading1"/>
-      </w:pPr>
-      <w:r>
-        <w:rPr>
-          <w:color w:val="003366"/>
-        </w:rPr>
-        <w:t>5. preprocessing.py — New Module (Swarni's Part)</w:t>
-      </w:r>
-    </w:p>
-    <w:p>
-      <w:pPr>
-        <w:spacing w:after="120"/>
-      </w:pPr>
-      <w:r>
-        <w:t>This module handles all text cleaning before the data is fed into the ML model.</w:t>
-      </w:r>
-    </w:p>
-    <w:tbl>
-      <w:tblPr>
-        <w:tblStyle w:val="LightGrid-Accent1"/>
-        <w:tblW w:type="auto" w:w="0"/>
-        <w:jc w:val="center"/>
-        <w:tblLook w:firstColumn="1" w:firstRow="1" w:lastColumn="0" w:lastRow="0" w:noHBand="0" w:noVBand="1" w:val="04A0"/>
-      </w:tblPr>
-      <w:tblGrid>
-        <w:gridCol w:w="3135"/>
-        <w:gridCol w:w="3135"/>
-        <w:gridCol w:w="3135"/>
-      </w:tblGrid>
-      <w:tr>
-        <w:tc>
-          <w:tcPr>
-            <w:tcW w:type="dxa" w:w="3135"/>
-          </w:tcPr>
-          <w:p>
-            <w:r>
-              <w:rPr>
-                <w:b/>
-                <w:sz w:val="20"/>
-              </w:rPr>
-              <w:t>Function</w:t>
-            </w:r>
-          </w:p>
-        </w:tc>
-        <w:tc>
-          <w:tcPr>
-            <w:tcW w:type="dxa" w:w="3135"/>
-          </w:tcPr>
-          <w:p>
-            <w:r>
-              <w:rPr>
-                <w:b/>
-                <w:sz w:val="20"/>
-              </w:rPr>
-              <w:t>Input</w:t>
-            </w:r>
-          </w:p>
-        </w:tc>
-        <w:tc>
-          <w:tcPr>
-            <w:tcW w:type="dxa" w:w="3135"/>
-          </w:tcPr>
-          <w:p>
-            <w:r>
-              <w:rPr>
-                <w:b/>
-                <w:sz w:val="20"/>
-              </w:rPr>
-              <w:t>Output</w:t>
-            </w:r>
-          </w:p>
-        </w:tc>
-      </w:tr>
-      <w:tr>
-        <w:tc>
-          <w:tcPr>
-            <w:tcW w:type="dxa" w:w="3135"/>
-          </w:tcPr>
-          <w:p>
-            <w:r>
-              <w:rPr>
-                <w:sz w:val="20"/>
-              </w:rPr>
-              <w:t>preprocess_text(text)</w:t>
-            </w:r>
-          </w:p>
-        </w:tc>
-        <w:tc>
-          <w:tcPr>
-            <w:tcW w:type="dxa" w:w="3135"/>
-          </w:tcPr>
-          <w:p>
-            <w:r>
-              <w:rPr>
-                <w:sz w:val="20"/>
-              </w:rPr>
-              <w:t>A single raw string</w:t>
-            </w:r>
-          </w:p>
-        </w:tc>
-        <w:tc>
-          <w:tcPr>
-            <w:tcW w:type="dxa" w:w="3135"/>
-          </w:tcPr>
-          <w:p>
-            <w:r>
-              <w:rPr>
-                <w:sz w:val="20"/>
-              </w:rPr>
-              <w:t>Cleaned string</w:t>
-            </w:r>
-          </w:p>
-        </w:tc>
-      </w:tr>
-      <w:tr>
-        <w:tc>
-          <w:tcPr>
-            <w:tcW w:type="dxa" w:w="3135"/>
-          </w:tcPr>
-          <w:p>
-            <w:r>
-              <w:rPr>
-                <w:sz w:val="20"/>
-              </w:rPr>
-              <w:t>preprocess_dataframe(df, column)</w:t>
-            </w:r>
-          </w:p>
-        </w:tc>
-        <w:tc>
-          <w:tcPr>
-            <w:tcW w:type="dxa" w:w="3135"/>
-          </w:tcPr>
-          <w:p>
-            <w:r>
-              <w:rPr>
-                <w:sz w:val="20"/>
-              </w:rPr>
-              <w:t>DataFrame with comment column</w:t>
-            </w:r>
-          </w:p>
-        </w:tc>
-        <w:tc>
-          <w:tcPr>
-            <w:tcW w:type="dxa" w:w="3135"/>
-          </w:tcPr>
-          <w:p>
-            <w:r>
-              <w:rPr>
-                <w:sz w:val="20"/>
-              </w:rPr>
-              <w:t>Same DataFrame + cleaned_comment column</w:t>
-            </w:r>
-          </w:p>
-        </w:tc>
-      </w:tr>
-    </w:tbl>
-    <w:p/>
-    <w:p>
-      <w:pPr>
-        <w:pStyle w:val="Heading2"/>
-      </w:pPr>
-      <w:r>
-        <w:rPr>
-          <w:color w:val="003366"/>
-        </w:rPr>
-        <w:t>Preprocessing Steps</w:t>
+        <w:t>Day 3 brought initial graphical user interface development and team code integration.</w:t>
       </w:r>
     </w:p>
     <w:p>
@@ -1581,18 +729,18 @@
       </w:pPr>
       <w:r>
         <w:rPr>
+          <w:rFonts w:ascii="Segoe UI" w:hAnsi="Segoe UI"/>
           <w:b/>
+          <w:sz w:val="20"/>
         </w:rPr>
-        <w:t xml:space="preserve">Step 1: </w:t>
+        <w:t xml:space="preserve">GUI Prototype: </w:t>
       </w:r>
-      <w:r/>
-    </w:p>
-    <w:p>
-      <w:pPr>
-        <w:spacing w:after="120"/>
-      </w:pPr>
       <w:r>
-        <w:t>Convert to string (handles non-string values like NaN)</w:t>
+        <w:rPr>
+          <w:rFonts w:ascii="Segoe UI" w:hAnsi="Segoe UI"/>
+          <w:sz w:val="20"/>
+        </w:rPr>
+        <w:t>Integrated GUI code contributed by team member dakshadagale establishing home and results screen frames.</w:t>
       </w:r>
     </w:p>
     <w:p>
@@ -1601,18 +749,42 @@
       </w:pPr>
       <w:r>
         <w:rPr>
+          <w:rFonts w:ascii="Segoe UI" w:hAnsi="Segoe UI"/>
           <w:b/>
+          <w:sz w:val="20"/>
         </w:rPr>
-        <w:t xml:space="preserve">Step 2: </w:t>
+        <w:t xml:space="preserve">File Picker &amp; Manual Entry: </w:t>
       </w:r>
-      <w:r/>
+      <w:r>
+        <w:rPr>
+          <w:rFonts w:ascii="Segoe UI" w:hAnsi="Segoe UI"/>
+          <w:sz w:val="20"/>
+        </w:rPr>
+        <w:t>Added file dialog support for CSV uploads and initial text boxes for comment entry.</w:t>
+      </w:r>
     </w:p>
     <w:p>
       <w:pPr>
-        <w:spacing w:after="120"/>
+        <w:pStyle w:val="Heading1"/>
       </w:pPr>
       <w:r>
-        <w:t>Convert to lowercase</w:t>
+        <w:rPr>
+          <w:b/>
+          <w:color w:val="1E56A0"/>
+          <w:sz w:val="32"/>
+        </w:rPr>
+        <w:t>5. Day 4 (2026-07-28): Model Upgrade &amp; 11,000 Comment Dataset</w:t>
+      </w:r>
+    </w:p>
+    <w:p>
+      <w:r>
+        <w:rPr>
+          <w:rFonts w:ascii="Segoe UI" w:hAnsi="Segoe UI"/>
+          <w:b w:val="0"/>
+          <w:i w:val="0"/>
+          <w:sz w:val="21"/>
+        </w:rPr>
+        <w:t>Day 4 represented a major machine learning leap forward in accuracy and dataset scale.</w:t>
       </w:r>
     </w:p>
     <w:p>
@@ -1621,18 +793,18 @@
       </w:pPr>
       <w:r>
         <w:rPr>
+          <w:rFonts w:ascii="Segoe UI" w:hAnsi="Segoe UI"/>
           <w:b/>
+          <w:sz w:val="20"/>
         </w:rPr>
-        <w:t xml:space="preserve">Step 3: </w:t>
+        <w:t xml:space="preserve">Logistic Regression Upgrade: </w:t>
       </w:r>
-      <w:r/>
-    </w:p>
-    <w:p>
-      <w:pPr>
-        <w:spacing w:after="120"/>
-      </w:pPr>
       <w:r>
-        <w:t>Remove URLs (http://, https://, www.)</w:t>
+        <w:rPr>
+          <w:rFonts w:ascii="Segoe UI" w:hAnsi="Segoe UI"/>
+          <w:sz w:val="20"/>
+        </w:rPr>
+        <w:t>Replaced baseline model with Logistic Regression combined with TF-IDF Vectorization (unigrams + bigrams, top 5,000 features).</w:t>
       </w:r>
     </w:p>
     <w:p>
@@ -1641,18 +813,18 @@
       </w:pPr>
       <w:r>
         <w:rPr>
+          <w:rFonts w:ascii="Segoe UI" w:hAnsi="Segoe UI"/>
           <w:b/>
+          <w:sz w:val="20"/>
         </w:rPr>
-        <w:t xml:space="preserve">Step 4: </w:t>
+        <w:t xml:space="preserve">11,000 Comment Dataset: </w:t>
       </w:r>
-      <w:r/>
-    </w:p>
-    <w:p>
-      <w:pPr>
-        <w:spacing w:after="120"/>
-      </w:pPr>
       <w:r>
-        <w:t>Remove punctuation, numbers, and special characters — keep only letters and spaces</w:t>
+        <w:rPr>
+          <w:rFonts w:ascii="Segoe UI" w:hAnsi="Segoe UI"/>
+          <w:sz w:val="20"/>
+        </w:rPr>
+        <w:t>Generated realistic 11,000-comment dataset (comments.csv) with controlled 5% label noise to emulate real social media data (~95% accuracy).</w:t>
       </w:r>
     </w:p>
     <w:p>
@@ -1661,18 +833,18 @@
       </w:pPr>
       <w:r>
         <w:rPr>
+          <w:rFonts w:ascii="Segoe UI" w:hAnsi="Segoe UI"/>
           <w:b/>
+          <w:sz w:val="20"/>
         </w:rPr>
-        <w:t xml:space="preserve">Step 5: </w:t>
+        <w:t xml:space="preserve">Batch Inference Export: </w:t>
       </w:r>
-      <w:r/>
-    </w:p>
-    <w:p>
-      <w:pPr>
-        <w:spacing w:after="120"/>
-      </w:pPr>
       <w:r>
-        <w:t>Remove English stop words using NLTK (words like "the", "is", "and", etc.)</w:t>
+        <w:rPr>
+          <w:rFonts w:ascii="Segoe UI" w:hAnsi="Segoe UI"/>
+          <w:sz w:val="20"/>
+        </w:rPr>
+        <w:t>Executed batch predictions across the 11,000 comments dataset saving output to predicted_sentiments.csv.</w:t>
       </w:r>
     </w:p>
     <w:p>
@@ -1681,44 +853,18 @@
       </w:pPr>
       <w:r>
         <w:rPr>
+          <w:rFonts w:ascii="Segoe UI" w:hAnsi="Segoe UI"/>
           <w:b/>
+          <w:sz w:val="20"/>
         </w:rPr>
-        <w:t xml:space="preserve">Step 6: </w:t>
+        <w:t xml:space="preserve">Comprehensive Theory Docs: </w:t>
       </w:r>
-      <w:r/>
-    </w:p>
-    <w:p>
-      <w:pPr>
-        <w:spacing w:after="120"/>
-      </w:pPr>
-      <w:r>
-        <w:t>Trim extra spaces</w:t>
-      </w:r>
-    </w:p>
-    <w:p>
-      <w:pPr>
-        <w:pStyle w:val="Heading2"/>
-      </w:pPr>
       <w:r>
         <w:rPr>
-          <w:color w:val="003366"/>
+          <w:rFonts w:ascii="Segoe UI" w:hAnsi="Segoe UI"/>
+          <w:sz w:val="20"/>
         </w:rPr>
-        <w:t>Test Result</w:t>
-      </w:r>
-    </w:p>
-    <w:p>
-      <w:pPr>
-        <w:spacing w:before="80" w:after="80"/>
-      </w:pPr>
-      <w:r>
-        <w:rPr>
-          <w:rFonts w:ascii="Consolas" w:hAnsi="Consolas"/>
-          <w:color w:val="1E1E1E"/>
-          <w:sz w:val="18"/>
-        </w:rPr>
-        <w:t>Original: "I absolutely LOVE this product!!! Visit https://abc.com #best @user123"</w:t>
-        <w:br/>
-        <w:t>Cleaned:  "absolutely love product visit best user"</w:t>
+        <w:t>Authored Model_Explanation.docx explaining TF-IDF math, Logistic Regression mechanics, and code functions.</w:t>
       </w:r>
     </w:p>
     <w:p>
@@ -1727,514 +873,22 @@
       </w:pPr>
       <w:r>
         <w:rPr>
-          <w:color w:val="003366"/>
+          <w:b/>
+          <w:color w:val="1E56A0"/>
+          <w:sz w:val="32"/>
         </w:rPr>
-        <w:t>6. train_model.py — Rishabh's Part (Core ML Pipeline)</w:t>
+        <w:t>6. Day 5 Today (2026-07-29): Modular Architecture &amp; Modern UI Redesign</w:t>
       </w:r>
     </w:p>
     <w:p>
-      <w:pPr>
-        <w:spacing w:after="120"/>
-      </w:pPr>
-      <w:r>
-        <w:t>This is the main machine learning module. It trains a Multinomial Naive Bayes classifier using TF-IDF features extracted from the preprocessed comments.</w:t>
-      </w:r>
-    </w:p>
-    <w:p>
-      <w:pPr>
-        <w:pStyle w:val="Heading2"/>
-      </w:pPr>
       <w:r>
         <w:rPr>
-          <w:color w:val="003366"/>
+          <w:rFonts w:ascii="Segoe UI" w:hAnsi="Segoe UI"/>
+          <w:b w:val="0"/>
+          <w:i w:val="0"/>
+          <w:sz w:val="21"/>
         </w:rPr>
-        <w:t>Step-by-Step Breakdown</w:t>
-      </w:r>
-    </w:p>
-    <w:tbl>
-      <w:tblPr>
-        <w:tblStyle w:val="LightGrid-Accent1"/>
-        <w:tblW w:type="auto" w:w="0"/>
-        <w:jc w:val="center"/>
-        <w:tblLook w:firstColumn="1" w:firstRow="1" w:lastColumn="0" w:lastRow="0" w:noHBand="0" w:noVBand="1" w:val="04A0"/>
-      </w:tblPr>
-      <w:tblGrid>
-        <w:gridCol w:w="3135"/>
-        <w:gridCol w:w="3135"/>
-        <w:gridCol w:w="3135"/>
-      </w:tblGrid>
-      <w:tr>
-        <w:tc>
-          <w:tcPr>
-            <w:tcW w:type="dxa" w:w="3135"/>
-          </w:tcPr>
-          <w:p>
-            <w:r>
-              <w:rPr>
-                <w:b/>
-                <w:sz w:val="20"/>
-              </w:rPr>
-              <w:t>Step</w:t>
-            </w:r>
-          </w:p>
-        </w:tc>
-        <w:tc>
-          <w:tcPr>
-            <w:tcW w:type="dxa" w:w="3135"/>
-          </w:tcPr>
-          <w:p>
-            <w:r>
-              <w:rPr>
-                <w:b/>
-                <w:sz w:val="20"/>
-              </w:rPr>
-              <w:t>What It Does</w:t>
-            </w:r>
-          </w:p>
-        </w:tc>
-        <w:tc>
-          <w:tcPr>
-            <w:tcW w:type="dxa" w:w="3135"/>
-          </w:tcPr>
-          <w:p>
-            <w:r>
-              <w:rPr>
-                <w:b/>
-                <w:sz w:val="20"/>
-              </w:rPr>
-              <w:t>Output</w:t>
-            </w:r>
-          </w:p>
-        </w:tc>
-      </w:tr>
-      <w:tr>
-        <w:tc>
-          <w:tcPr>
-            <w:tcW w:type="dxa" w:w="3135"/>
-          </w:tcPr>
-          <w:p>
-            <w:r>
-              <w:rPr>
-                <w:sz w:val="20"/>
-              </w:rPr>
-              <w:t>1. Load Dataset</w:t>
-            </w:r>
-          </w:p>
-        </w:tc>
-        <w:tc>
-          <w:tcPr>
-            <w:tcW w:type="dxa" w:w="3135"/>
-          </w:tcPr>
-          <w:p>
-            <w:r>
-              <w:rPr>
-                <w:sz w:val="20"/>
-              </w:rPr>
-              <w:t>Reads data/comments.csv into a Pandas DataFrame</w:t>
-            </w:r>
-          </w:p>
-        </w:tc>
-        <w:tc>
-          <w:tcPr>
-            <w:tcW w:type="dxa" w:w="3135"/>
-          </w:tcPr>
-          <w:p>
-            <w:r>
-              <w:rPr>
-                <w:sz w:val="20"/>
-              </w:rPr>
-              <w:t>DataFrame with 60 rows</w:t>
-            </w:r>
-          </w:p>
-        </w:tc>
-      </w:tr>
-      <w:tr>
-        <w:tc>
-          <w:tcPr>
-            <w:tcW w:type="dxa" w:w="3135"/>
-          </w:tcPr>
-          <w:p>
-            <w:r>
-              <w:rPr>
-                <w:sz w:val="20"/>
-              </w:rPr>
-              <w:t>2. Preprocess</w:t>
-            </w:r>
-          </w:p>
-        </w:tc>
-        <w:tc>
-          <w:tcPr>
-            <w:tcW w:type="dxa" w:w="3135"/>
-          </w:tcPr>
-          <w:p>
-            <w:r>
-              <w:rPr>
-                <w:sz w:val="20"/>
-              </w:rPr>
-              <w:t>Calls preprocess_dataframe() from preprocessing.py</w:t>
-            </w:r>
-          </w:p>
-        </w:tc>
-        <w:tc>
-          <w:tcPr>
-            <w:tcW w:type="dxa" w:w="3135"/>
-          </w:tcPr>
-          <w:p>
-            <w:r>
-              <w:rPr>
-                <w:sz w:val="20"/>
-              </w:rPr>
-              <w:t>Adds cleaned_comment column</w:t>
-            </w:r>
-          </w:p>
-        </w:tc>
-      </w:tr>
-      <w:tr>
-        <w:tc>
-          <w:tcPr>
-            <w:tcW w:type="dxa" w:w="3135"/>
-          </w:tcPr>
-          <w:p>
-            <w:r>
-              <w:rPr>
-                <w:sz w:val="20"/>
-              </w:rPr>
-              <w:t>3. TF-IDF Vectorization</w:t>
-            </w:r>
-          </w:p>
-        </w:tc>
-        <w:tc>
-          <w:tcPr>
-            <w:tcW w:type="dxa" w:w="3135"/>
-          </w:tcPr>
-          <w:p>
-            <w:r>
-              <w:rPr>
-                <w:sz w:val="20"/>
-              </w:rPr>
-              <w:t>TfidfVectorizer converts cleaned text into numbers</w:t>
-            </w:r>
-          </w:p>
-        </w:tc>
-        <w:tc>
-          <w:tcPr>
-            <w:tcW w:type="dxa" w:w="3135"/>
-          </w:tcPr>
-          <w:p>
-            <w:r>
-              <w:rPr>
-                <w:sz w:val="20"/>
-              </w:rPr>
-              <w:t>Sparse matrix X (60 x 176)</w:t>
-            </w:r>
-          </w:p>
-        </w:tc>
-      </w:tr>
-      <w:tr>
-        <w:tc>
-          <w:tcPr>
-            <w:tcW w:type="dxa" w:w="3135"/>
-          </w:tcPr>
-          <w:p>
-            <w:r>
-              <w:rPr>
-                <w:sz w:val="20"/>
-              </w:rPr>
-              <w:t>4. Train-Test Split</w:t>
-            </w:r>
-          </w:p>
-        </w:tc>
-        <w:tc>
-          <w:tcPr>
-            <w:tcW w:type="dxa" w:w="3135"/>
-          </w:tcPr>
-          <w:p>
-            <w:r>
-              <w:rPr>
-                <w:sz w:val="20"/>
-              </w:rPr>
-              <w:t>80/20 split using train_test_split (random_state=42)</w:t>
-            </w:r>
-          </w:p>
-        </w:tc>
-        <w:tc>
-          <w:tcPr>
-            <w:tcW w:type="dxa" w:w="3135"/>
-          </w:tcPr>
-          <w:p>
-            <w:r>
-              <w:rPr>
-                <w:sz w:val="20"/>
-              </w:rPr>
-              <w:t>48 train + 12 test samples</w:t>
-            </w:r>
-          </w:p>
-        </w:tc>
-      </w:tr>
-      <w:tr>
-        <w:tc>
-          <w:tcPr>
-            <w:tcW w:type="dxa" w:w="3135"/>
-          </w:tcPr>
-          <w:p>
-            <w:r>
-              <w:rPr>
-                <w:sz w:val="20"/>
-              </w:rPr>
-              <w:t>5. Train Model</w:t>
-            </w:r>
-          </w:p>
-        </w:tc>
-        <w:tc>
-          <w:tcPr>
-            <w:tcW w:type="dxa" w:w="3135"/>
-          </w:tcPr>
-          <w:p>
-            <w:r>
-              <w:rPr>
-                <w:sz w:val="20"/>
-              </w:rPr>
-              <w:t>MultinomialNB().fit(X_train, y_train)</w:t>
-            </w:r>
-          </w:p>
-        </w:tc>
-        <w:tc>
-          <w:tcPr>
-            <w:tcW w:type="dxa" w:w="3135"/>
-          </w:tcPr>
-          <w:p>
-            <w:r>
-              <w:rPr>
-                <w:sz w:val="20"/>
-              </w:rPr>
-              <w:t>Trained Naive Bayes model</w:t>
-            </w:r>
-          </w:p>
-        </w:tc>
-      </w:tr>
-      <w:tr>
-        <w:tc>
-          <w:tcPr>
-            <w:tcW w:type="dxa" w:w="3135"/>
-          </w:tcPr>
-          <w:p>
-            <w:r>
-              <w:rPr>
-                <w:sz w:val="20"/>
-              </w:rPr>
-              <w:t>6. Evaluate</w:t>
-            </w:r>
-          </w:p>
-        </w:tc>
-        <w:tc>
-          <w:tcPr>
-            <w:tcW w:type="dxa" w:w="3135"/>
-          </w:tcPr>
-          <w:p>
-            <w:r>
-              <w:rPr>
-                <w:sz w:val="20"/>
-              </w:rPr>
-              <w:t>accuracy_score + classification_report</w:t>
-            </w:r>
-          </w:p>
-        </w:tc>
-        <w:tc>
-          <w:tcPr>
-            <w:tcW w:type="dxa" w:w="3135"/>
-          </w:tcPr>
-          <w:p>
-            <w:r>
-              <w:rPr>
-                <w:sz w:val="20"/>
-              </w:rPr>
-              <w:t>Accuracy printed to console</w:t>
-            </w:r>
-          </w:p>
-        </w:tc>
-      </w:tr>
-      <w:tr>
-        <w:tc>
-          <w:tcPr>
-            <w:tcW w:type="dxa" w:w="3135"/>
-          </w:tcPr>
-          <w:p>
-            <w:r>
-              <w:rPr>
-                <w:sz w:val="20"/>
-              </w:rPr>
-              <w:t>7. Save Model</w:t>
-            </w:r>
-          </w:p>
-        </w:tc>
-        <w:tc>
-          <w:tcPr>
-            <w:tcW w:type="dxa" w:w="3135"/>
-          </w:tcPr>
-          <w:p>
-            <w:r>
-              <w:rPr>
-                <w:sz w:val="20"/>
-              </w:rPr>
-              <w:t>joblib.dump() saves model and vectorizer</w:t>
-            </w:r>
-          </w:p>
-        </w:tc>
-        <w:tc>
-          <w:tcPr>
-            <w:tcW w:type="dxa" w:w="3135"/>
-          </w:tcPr>
-          <w:p>
-            <w:r>
-              <w:rPr>
-                <w:sz w:val="20"/>
-              </w:rPr>
-              <w:t>models/model.pkl + models/vectorizer.pkl</w:t>
-            </w:r>
-          </w:p>
-        </w:tc>
-      </w:tr>
-    </w:tbl>
-    <w:p/>
-    <w:p>
-      <w:pPr>
-        <w:pStyle w:val="Heading2"/>
-      </w:pPr>
-      <w:r>
-        <w:rPr>
-          <w:color w:val="003366"/>
-        </w:rPr>
-        <w:t>What is TF-IDF?</w:t>
-      </w:r>
-    </w:p>
-    <w:p>
-      <w:pPr>
-        <w:spacing w:after="120"/>
-      </w:pPr>
-      <w:r>
-        <w:t>TF-IDF stands for Term Frequency - Inverse Document Frequency. Machine learning models cannot understand raw text — they need numbers. TF-IDF converts each comment into a numerical vector where each number represents how important a word is in that comment relative to all other comments.</w:t>
-      </w:r>
-    </w:p>
-    <w:p>
-      <w:pPr>
-        <w:spacing w:after="120"/>
-      </w:pPr>
-      <w:r>
-        <w:t>Example:</w:t>
-      </w:r>
-    </w:p>
-    <w:p>
-      <w:pPr>
-        <w:spacing w:before="80" w:after="80"/>
-      </w:pPr>
-      <w:r>
-        <w:rPr>
-          <w:rFonts w:ascii="Consolas" w:hAnsi="Consolas"/>
-          <w:color w:val="1E1E1E"/>
-          <w:sz w:val="18"/>
-        </w:rPr>
-        <w:t>Comments:</w:t>
-        <w:br/>
-        <w:t xml:space="preserve">  "love product"</w:t>
-        <w:br/>
-        <w:t xml:space="preserve">  "hate service"</w:t>
-        <w:br/>
-        <w:br/>
-        <w:t>Vocabulary: love=0, product=1, hate=2, service=3</w:t>
-        <w:br/>
-        <w:br/>
-        <w:t>Numeric Matrix (simplified):</w:t>
-        <w:br/>
-        <w:t xml:space="preserve">  [0.71, 0.71, 0.00, 0.00]   ← "love product"</w:t>
-        <w:br/>
-        <w:t xml:space="preserve">  [0.00, 0.00, 0.71, 0.71]   ← "hate service"</w:t>
-      </w:r>
-    </w:p>
-    <w:p>
-      <w:pPr>
-        <w:pStyle w:val="Heading2"/>
-      </w:pPr>
-      <w:r>
-        <w:rPr>
-          <w:color w:val="003366"/>
-        </w:rPr>
-        <w:t>What is Multinomial Naive Bayes?</w:t>
-      </w:r>
-    </w:p>
-    <w:p>
-      <w:pPr>
-        <w:spacing w:after="120"/>
-      </w:pPr>
-      <w:r>
-        <w:t>Naive Bayes is a classification algorithm based on Bayes' Theorem. It learns the probability of each word appearing in Positive, Negative, or Neutral comments. When given a new comment, it calculates which sentiment is most probable based on the words present.</w:t>
-      </w:r>
-    </w:p>
-    <w:p>
-      <w:pPr>
-        <w:pStyle w:val="Heading2"/>
-      </w:pPr>
-      <w:r>
-        <w:rPr>
-          <w:color w:val="003366"/>
-        </w:rPr>
-        <w:t>Training Output</w:t>
-      </w:r>
-    </w:p>
-    <w:p>
-      <w:pPr>
-        <w:spacing w:before="80" w:after="80"/>
-      </w:pPr>
-      <w:r>
-        <w:rPr>
-          <w:rFonts w:ascii="Consolas" w:hAnsi="Consolas"/>
-          <w:color w:val="1E1E1E"/>
-          <w:sz w:val="18"/>
-        </w:rPr>
-        <w:t>Dataset loaded: 60 comments, 3 columns</w:t>
-        <w:br/>
-        <w:t>Feature matrix: 60 comments x 176 unique words</w:t>
-        <w:br/>
-        <w:t>Training data: 48 comments</w:t>
-        <w:br/>
-        <w:t>Testing data:  12 comments</w:t>
-        <w:br/>
-        <w:t>Accuracy: 50.00%</w:t>
-        <w:br/>
-        <w:br/>
-        <w:t>Classification Report:</w:t>
-        <w:br/>
-        <w:t xml:space="preserve">              precision    recall  f1-score   support</w:t>
-        <w:br/>
-        <w:t xml:space="preserve">    Negative       0.33      1.00      0.50         2</w:t>
-        <w:br/>
-        <w:t xml:space="preserve">     Neutral       0.50      1.00      0.67         2</w:t>
-        <w:br/>
-        <w:t xml:space="preserve">    Positive       1.00      0.25      0.40         8</w:t>
-        <w:br/>
-        <w:t xml:space="preserve">    accuracy                           0.50        12</w:t>
-        <w:br/>
-        <w:t xml:space="preserve">   macro avg       0.61      0.75      0.52        12</w:t>
-        <w:br/>
-        <w:t>weighted avg       0.81      0.50      0.46        12</w:t>
-      </w:r>
-    </w:p>
-    <w:p>
-      <w:pPr>
-        <w:spacing w:after="120"/>
-      </w:pPr>
-      <w:r>
-        <w:t>Note: 50% accuracy is expected with only 60 training samples. With a larger dataset (thousands of comments), accuracy would be significantly higher. For this academic project, the pipeline and methodology are correct, which is what matters.</w:t>
-      </w:r>
-    </w:p>
-    <w:p>
-      <w:pPr>
-        <w:pStyle w:val="Heading2"/>
-      </w:pPr>
-      <w:r>
-        <w:rPr>
-          <w:color w:val="003366"/>
-        </w:rPr>
-        <w:t>Saved Files</w:t>
+        <w:t>Today, the project underwent a complete production-grade refactoring and UI modernization.</w:t>
       </w:r>
     </w:p>
     <w:p>
@@ -2242,7 +896,19 @@
         <w:pStyle w:val="ListBullet"/>
       </w:pPr>
       <w:r>
-        <w:t>models/model.pkl — The trained Naive Bayes model</w:t>
+        <w:rPr>
+          <w:rFonts w:ascii="Segoe UI" w:hAnsi="Segoe UI"/>
+          <w:b/>
+          <w:sz w:val="20"/>
+        </w:rPr>
+        <w:t xml:space="preserve">Package Restructuring: </w:t>
+      </w:r>
+      <w:r>
+        <w:rPr>
+          <w:rFonts w:ascii="Segoe UI" w:hAnsi="Segoe UI"/>
+          <w:sz w:val="20"/>
+        </w:rPr>
+        <w:t>Organized project into clean Python packages: src/core (pipeline, model manager, train, predict, preprocess), src/analytics (statistics), src/ui (ui_manager), src/utils (helpers, doc generators).</w:t>
       </w:r>
     </w:p>
     <w:p>
@@ -2250,7 +916,79 @@
         <w:pStyle w:val="ListBullet"/>
       </w:pPr>
       <w:r>
-        <w:t>models/vectorizer.pkl — The fitted TF-IDF vectorizer (needed to transform new text the same way)</w:t>
+        <w:rPr>
+          <w:rFonts w:ascii="Segoe UI" w:hAnsi="Segoe UI"/>
+          <w:b/>
+          <w:sz w:val="20"/>
+        </w:rPr>
+        <w:t xml:space="preserve">Desktop Dashboard (SentimentApp): </w:t>
+      </w:r>
+      <w:r>
+        <w:rPr>
+          <w:rFonts w:ascii="Segoe UI" w:hAnsi="Segoe UI"/>
+          <w:sz w:val="20"/>
+        </w:rPr>
+        <w:t>Built state-of-the-art Tkinter desktop dashboard in app.py &amp; ui_manager.py featuring real-time positive/negative/neutral count cards (4414 Positive, 4385 Negative, 2201 Neutral), interactive processed data treeviews, and non-blocking background threading.</w:t>
+      </w:r>
+    </w:p>
+    <w:p>
+      <w:pPr>
+        <w:pStyle w:val="ListBullet"/>
+      </w:pPr>
+      <w:r>
+        <w:rPr>
+          <w:rFonts w:ascii="Segoe UI" w:hAnsi="Segoe UI"/>
+          <w:b/>
+          <w:sz w:val="20"/>
+        </w:rPr>
+        <w:t xml:space="preserve">Clean &amp; Focused UI: </w:t>
+      </w:r>
+      <w:r>
+        <w:rPr>
+          <w:rFonts w:ascii="Segoe UI" w:hAnsi="Segoe UI"/>
+          <w:sz w:val="20"/>
+        </w:rPr>
+        <w:t>Removed graph visualization clutter from UI and pipeline per user specifications to ensure maximum responsiveness and visual clarity.</w:t>
+      </w:r>
+    </w:p>
+    <w:p>
+      <w:pPr>
+        <w:pStyle w:val="ListBullet"/>
+      </w:pPr>
+      <w:r>
+        <w:rPr>
+          <w:rFonts w:ascii="Segoe UI" w:hAnsi="Segoe UI"/>
+          <w:b/>
+          <w:sz w:val="20"/>
+        </w:rPr>
+        <w:t xml:space="preserve">Unnecessary File Removal: </w:t>
+      </w:r>
+      <w:r>
+        <w:rPr>
+          <w:rFonts w:ascii="Segoe UI" w:hAnsi="Segoe UI"/>
+          <w:sz w:val="20"/>
+        </w:rPr>
+        <w:t>Purged redundant scripts (gui.py, visualization.py), MS Word lock files, empty directories, and bytecode caches.</w:t>
+      </w:r>
+    </w:p>
+    <w:p>
+      <w:pPr>
+        <w:pStyle w:val="ListBullet"/>
+      </w:pPr>
+      <w:r>
+        <w:rPr>
+          <w:rFonts w:ascii="Segoe UI" w:hAnsi="Segoe UI"/>
+          <w:b/>
+          <w:sz w:val="20"/>
+        </w:rPr>
+        <w:t xml:space="preserve">Git History Consolidation: </w:t>
+      </w:r>
+      <w:r>
+        <w:rPr>
+          <w:rFonts w:ascii="Segoe UI" w:hAnsi="Segoe UI"/>
+          <w:sz w:val="20"/>
+        </w:rPr>
+        <w:t>Squashed trial/back-and-forth commits into a clean, professional commit history and updated GitHub main.</w:t>
       </w:r>
     </w:p>
     <w:p>
@@ -2259,845 +997,107 @@
       </w:pPr>
       <w:r>
         <w:rPr>
-          <w:color w:val="003366"/>
+          <w:b/>
+          <w:color w:val="1E56A0"/>
+          <w:sz w:val="32"/>
         </w:rPr>
-        <w:t>7. requirements.txt — Fixed</w:t>
+        <w:t>7. Day 6 Tomorrow (2026-07-30+): Production Distribution &amp; Future Roadmap</w:t>
+      </w:r>
+    </w:p>
+    <w:p>
+      <w:r>
+        <w:rPr>
+          <w:rFonts w:ascii="Segoe UI" w:hAnsi="Segoe UI"/>
+          <w:b w:val="0"/>
+          <w:i w:val="0"/>
+          <w:sz w:val="21"/>
+        </w:rPr>
+        <w:t>Planned engineering roadmap for tomorrow and upcoming release cycles:</w:t>
       </w:r>
     </w:p>
     <w:p>
       <w:pPr>
-        <w:spacing w:after="120"/>
+        <w:pStyle w:val="ListBullet"/>
       </w:pPr>
       <w:r>
-        <w:t>The old file "REQUIRMENTS.TXT" was misspelled and missing dependencies. It has been deleted and replaced with a properly named "requirements.txt".</w:t>
+        <w:rPr>
+          <w:rFonts w:ascii="Segoe UI" w:hAnsi="Segoe UI"/>
+          <w:b/>
+          <w:sz w:val="20"/>
+        </w:rPr>
+        <w:t xml:space="preserve">Export Module: </w:t>
       </w:r>
-    </w:p>
-    <w:tbl>
-      <w:tblPr>
-        <w:tblStyle w:val="LightGrid-Accent1"/>
-        <w:tblW w:type="auto" w:w="0"/>
-        <w:jc w:val="center"/>
-        <w:tblLook w:firstColumn="1" w:firstRow="1" w:lastColumn="0" w:lastRow="0" w:noHBand="0" w:noVBand="1" w:val="04A0"/>
-      </w:tblPr>
-      <w:tblGrid>
-        <w:gridCol w:w="4703"/>
-        <w:gridCol w:w="4703"/>
-      </w:tblGrid>
-      <w:tr>
-        <w:tc>
-          <w:tcPr>
-            <w:tcW w:type="dxa" w:w="4703"/>
-          </w:tcPr>
-          <w:p>
-            <w:r>
-              <w:rPr>
-                <w:b/>
-                <w:sz w:val="20"/>
-              </w:rPr>
-              <w:t>Package</w:t>
-            </w:r>
-          </w:p>
-        </w:tc>
-        <w:tc>
-          <w:tcPr>
-            <w:tcW w:type="dxa" w:w="4703"/>
-          </w:tcPr>
-          <w:p>
-            <w:r>
-              <w:rPr>
-                <w:b/>
-                <w:sz w:val="20"/>
-              </w:rPr>
-              <w:t>Purpose</w:t>
-            </w:r>
-          </w:p>
-        </w:tc>
-      </w:tr>
-      <w:tr>
-        <w:tc>
-          <w:tcPr>
-            <w:tcW w:type="dxa" w:w="4703"/>
-          </w:tcPr>
-          <w:p>
-            <w:r>
-              <w:rPr>
-                <w:sz w:val="20"/>
-              </w:rPr>
-              <w:t>pandas</w:t>
-            </w:r>
-          </w:p>
-        </w:tc>
-        <w:tc>
-          <w:tcPr>
-            <w:tcW w:type="dxa" w:w="4703"/>
-          </w:tcPr>
-          <w:p>
-            <w:r>
-              <w:rPr>
-                <w:sz w:val="20"/>
-              </w:rPr>
-              <w:t>Data manipulation and CSV reading</w:t>
-            </w:r>
-          </w:p>
-        </w:tc>
-      </w:tr>
-      <w:tr>
-        <w:tc>
-          <w:tcPr>
-            <w:tcW w:type="dxa" w:w="4703"/>
-          </w:tcPr>
-          <w:p>
-            <w:r>
-              <w:rPr>
-                <w:sz w:val="20"/>
-              </w:rPr>
-              <w:t>numpy</w:t>
-            </w:r>
-          </w:p>
-        </w:tc>
-        <w:tc>
-          <w:tcPr>
-            <w:tcW w:type="dxa" w:w="4703"/>
-          </w:tcPr>
-          <w:p>
-            <w:r>
-              <w:rPr>
-                <w:sz w:val="20"/>
-              </w:rPr>
-              <w:t>Numerical operations</w:t>
-            </w:r>
-          </w:p>
-        </w:tc>
-      </w:tr>
-      <w:tr>
-        <w:tc>
-          <w:tcPr>
-            <w:tcW w:type="dxa" w:w="4703"/>
-          </w:tcPr>
-          <w:p>
-            <w:r>
-              <w:rPr>
-                <w:sz w:val="20"/>
-              </w:rPr>
-              <w:t>matplotlib</w:t>
-            </w:r>
-          </w:p>
-        </w:tc>
-        <w:tc>
-          <w:tcPr>
-            <w:tcW w:type="dxa" w:w="4703"/>
-          </w:tcPr>
-          <w:p>
-            <w:r>
-              <w:rPr>
-                <w:sz w:val="20"/>
-              </w:rPr>
-              <w:t>Chart generation (for visualization module)</w:t>
-            </w:r>
-          </w:p>
-        </w:tc>
-      </w:tr>
-      <w:tr>
-        <w:tc>
-          <w:tcPr>
-            <w:tcW w:type="dxa" w:w="4703"/>
-          </w:tcPr>
-          <w:p>
-            <w:r>
-              <w:rPr>
-                <w:sz w:val="20"/>
-              </w:rPr>
-              <w:t>scikit-learn</w:t>
-            </w:r>
-          </w:p>
-        </w:tc>
-        <w:tc>
-          <w:tcPr>
-            <w:tcW w:type="dxa" w:w="4703"/>
-          </w:tcPr>
-          <w:p>
-            <w:r>
-              <w:rPr>
-                <w:sz w:val="20"/>
-              </w:rPr>
-              <w:t>TF-IDF, train-test split, Naive Bayes model</w:t>
-            </w:r>
-          </w:p>
-        </w:tc>
-      </w:tr>
-      <w:tr>
-        <w:tc>
-          <w:tcPr>
-            <w:tcW w:type="dxa" w:w="4703"/>
-          </w:tcPr>
-          <w:p>
-            <w:r>
-              <w:rPr>
-                <w:sz w:val="20"/>
-              </w:rPr>
-              <w:t>nltk</w:t>
-            </w:r>
-          </w:p>
-        </w:tc>
-        <w:tc>
-          <w:tcPr>
-            <w:tcW w:type="dxa" w:w="4703"/>
-          </w:tcPr>
-          <w:p>
-            <w:r>
-              <w:rPr>
-                <w:sz w:val="20"/>
-              </w:rPr>
-              <w:t>Stop words removal for text preprocessing</w:t>
-            </w:r>
-          </w:p>
-        </w:tc>
-      </w:tr>
-      <w:tr>
-        <w:tc>
-          <w:tcPr>
-            <w:tcW w:type="dxa" w:w="4703"/>
-          </w:tcPr>
-          <w:p>
-            <w:r>
-              <w:rPr>
-                <w:sz w:val="20"/>
-              </w:rPr>
-              <w:t>joblib</w:t>
-            </w:r>
-          </w:p>
-        </w:tc>
-        <w:tc>
-          <w:tcPr>
-            <w:tcW w:type="dxa" w:w="4703"/>
-          </w:tcPr>
-          <w:p>
-            <w:r>
-              <w:rPr>
-                <w:sz w:val="20"/>
-              </w:rPr>
-              <w:t>Saving and loading the trained model</w:t>
-            </w:r>
-          </w:p>
-        </w:tc>
-      </w:tr>
-    </w:tbl>
-    <w:p/>
-    <w:p>
-      <w:pPr>
-        <w:spacing w:after="120"/>
-      </w:pPr>
       <w:r>
-        <w:t>Note: textblob has been removed since we replaced the lexicon-based approach with a proper ML model.</w:t>
+        <w:rPr>
+          <w:rFonts w:ascii="Segoe UI" w:hAnsi="Segoe UI"/>
+          <w:sz w:val="20"/>
+        </w:rPr>
+        <w:t>Implement one-click export buttons on the dashboard to save analyzed data and summary tables to Excel (.xlsx) and PDF format.</w:t>
       </w:r>
     </w:p>
     <w:p>
       <w:pPr>
-        <w:pStyle w:val="Heading1"/>
+        <w:pStyle w:val="ListBullet"/>
       </w:pPr>
       <w:r>
         <w:rPr>
-          <w:color w:val="003366"/>
+          <w:rFonts w:ascii="Segoe UI" w:hAnsi="Segoe UI"/>
+          <w:b/>
+          <w:sz w:val="20"/>
         </w:rPr>
-        <w:t>8. Current Project Status</w:t>
+        <w:t xml:space="preserve">Single-Comment Live Predictor Card: </w:t>
+      </w:r>
+      <w:r>
+        <w:rPr>
+          <w:rFonts w:ascii="Segoe UI" w:hAnsi="Segoe UI"/>
+          <w:sz w:val="20"/>
+        </w:rPr>
+        <w:t>Add an interactive instant sentiment scoring card on the dashboard home view for real-time text analysis without uploading files.</w:t>
       </w:r>
     </w:p>
     <w:p>
       <w:pPr>
-        <w:spacing w:after="120"/>
-      </w:pPr>
-      <w:r>
-        <w:t>The pipeline from data input through model training and prediction is complete. The remaining modules (statistics, visualization, and full GUI integration) are assigned to other team members.</w:t>
-      </w:r>
-    </w:p>
-    <w:tbl>
-      <w:tblPr>
-        <w:tblStyle w:val="LightGrid-Accent1"/>
-        <w:tblW w:type="auto" w:w="0"/>
-        <w:jc w:val="center"/>
-        <w:tblLook w:firstColumn="1" w:firstRow="1" w:lastColumn="0" w:lastRow="0" w:noHBand="0" w:noVBand="1" w:val="04A0"/>
-      </w:tblPr>
-      <w:tblGrid>
-        <w:gridCol w:w="3135"/>
-        <w:gridCol w:w="3135"/>
-        <w:gridCol w:w="3135"/>
-      </w:tblGrid>
-      <w:tr>
-        <w:tc>
-          <w:tcPr>
-            <w:tcW w:type="dxa" w:w="3135"/>
-          </w:tcPr>
-          <w:p>
-            <w:r>
-              <w:rPr>
-                <w:b/>
-                <w:sz w:val="20"/>
-              </w:rPr>
-              <w:t>Module</w:t>
-            </w:r>
-          </w:p>
-        </w:tc>
-        <w:tc>
-          <w:tcPr>
-            <w:tcW w:type="dxa" w:w="3135"/>
-          </w:tcPr>
-          <w:p>
-            <w:r>
-              <w:rPr>
-                <w:b/>
-                <w:sz w:val="20"/>
-              </w:rPr>
-              <w:t>Owner</w:t>
-            </w:r>
-          </w:p>
-        </w:tc>
-        <w:tc>
-          <w:tcPr>
-            <w:tcW w:type="dxa" w:w="3135"/>
-          </w:tcPr>
-          <w:p>
-            <w:r>
-              <w:rPr>
-                <w:b/>
-                <w:sz w:val="20"/>
-              </w:rPr>
-              <w:t>Status</w:t>
-            </w:r>
-          </w:p>
-        </w:tc>
-      </w:tr>
-      <w:tr>
-        <w:tc>
-          <w:tcPr>
-            <w:tcW w:type="dxa" w:w="3135"/>
-          </w:tcPr>
-          <w:p>
-            <w:r>
-              <w:rPr>
-                <w:sz w:val="20"/>
-              </w:rPr>
-              <w:t>data/comments.csv</w:t>
-            </w:r>
-          </w:p>
-        </w:tc>
-        <w:tc>
-          <w:tcPr>
-            <w:tcW w:type="dxa" w:w="3135"/>
-          </w:tcPr>
-          <w:p>
-            <w:r>
-              <w:rPr>
-                <w:sz w:val="20"/>
-              </w:rPr>
-              <w:t>Swarni</w:t>
-            </w:r>
-          </w:p>
-        </w:tc>
-        <w:tc>
-          <w:tcPr>
-            <w:tcW w:type="dxa" w:w="3135"/>
-          </w:tcPr>
-          <w:p>
-            <w:r>
-              <w:rPr>
-                <w:sz w:val="20"/>
-              </w:rPr>
-              <w:t>Done</w:t>
-            </w:r>
-          </w:p>
-        </w:tc>
-      </w:tr>
-      <w:tr>
-        <w:tc>
-          <w:tcPr>
-            <w:tcW w:type="dxa" w:w="3135"/>
-          </w:tcPr>
-          <w:p>
-            <w:r>
-              <w:rPr>
-                <w:sz w:val="20"/>
-              </w:rPr>
-              <w:t>preprocessing.py</w:t>
-            </w:r>
-          </w:p>
-        </w:tc>
-        <w:tc>
-          <w:tcPr>
-            <w:tcW w:type="dxa" w:w="3135"/>
-          </w:tcPr>
-          <w:p>
-            <w:r>
-              <w:rPr>
-                <w:sz w:val="20"/>
-              </w:rPr>
-              <w:t>Swarni</w:t>
-            </w:r>
-          </w:p>
-        </w:tc>
-        <w:tc>
-          <w:tcPr>
-            <w:tcW w:type="dxa" w:w="3135"/>
-          </w:tcPr>
-          <w:p>
-            <w:r>
-              <w:rPr>
-                <w:sz w:val="20"/>
-              </w:rPr>
-              <w:t>Done</w:t>
-            </w:r>
-          </w:p>
-        </w:tc>
-      </w:tr>
-      <w:tr>
-        <w:tc>
-          <w:tcPr>
-            <w:tcW w:type="dxa" w:w="3135"/>
-          </w:tcPr>
-          <w:p>
-            <w:r>
-              <w:rPr>
-                <w:sz w:val="20"/>
-              </w:rPr>
-              <w:t>train_model.py</w:t>
-            </w:r>
-          </w:p>
-        </w:tc>
-        <w:tc>
-          <w:tcPr>
-            <w:tcW w:type="dxa" w:w="3135"/>
-          </w:tcPr>
-          <w:p>
-            <w:r>
-              <w:rPr>
-                <w:sz w:val="20"/>
-              </w:rPr>
-              <w:t>Rishabh</w:t>
-            </w:r>
-          </w:p>
-        </w:tc>
-        <w:tc>
-          <w:tcPr>
-            <w:tcW w:type="dxa" w:w="3135"/>
-          </w:tcPr>
-          <w:p>
-            <w:r>
-              <w:rPr>
-                <w:sz w:val="20"/>
-              </w:rPr>
-              <w:t>Done</w:t>
-            </w:r>
-          </w:p>
-        </w:tc>
-      </w:tr>
-      <w:tr>
-        <w:tc>
-          <w:tcPr>
-            <w:tcW w:type="dxa" w:w="3135"/>
-          </w:tcPr>
-          <w:p>
-            <w:r>
-              <w:rPr>
-                <w:sz w:val="20"/>
-              </w:rPr>
-              <w:t>predict.py</w:t>
-            </w:r>
-          </w:p>
-        </w:tc>
-        <w:tc>
-          <w:tcPr>
-            <w:tcW w:type="dxa" w:w="3135"/>
-          </w:tcPr>
-          <w:p>
-            <w:r>
-              <w:rPr>
-                <w:sz w:val="20"/>
-              </w:rPr>
-              <w:t>Prathmesh</w:t>
-            </w:r>
-          </w:p>
-        </w:tc>
-        <w:tc>
-          <w:tcPr>
-            <w:tcW w:type="dxa" w:w="3135"/>
-          </w:tcPr>
-          <w:p>
-            <w:r>
-              <w:rPr>
-                <w:sz w:val="20"/>
-              </w:rPr>
-              <w:t>Done</w:t>
-            </w:r>
-          </w:p>
-        </w:tc>
-      </w:tr>
-      <w:tr>
-        <w:tc>
-          <w:tcPr>
-            <w:tcW w:type="dxa" w:w="3135"/>
-          </w:tcPr>
-          <w:p>
-            <w:r>
-              <w:rPr>
-                <w:sz w:val="20"/>
-              </w:rPr>
-              <w:t>gui.py (basic)</w:t>
-            </w:r>
-          </w:p>
-        </w:tc>
-        <w:tc>
-          <w:tcPr>
-            <w:tcW w:type="dxa" w:w="3135"/>
-          </w:tcPr>
-          <w:p>
-            <w:r>
-              <w:rPr>
-                <w:sz w:val="20"/>
-              </w:rPr>
-              <w:t>Daksha</w:t>
-            </w:r>
-          </w:p>
-        </w:tc>
-        <w:tc>
-          <w:tcPr>
-            <w:tcW w:type="dxa" w:w="3135"/>
-          </w:tcPr>
-          <w:p>
-            <w:r>
-              <w:rPr>
-                <w:sz w:val="20"/>
-              </w:rPr>
-              <w:t>Done (bug fixes)</w:t>
-            </w:r>
-          </w:p>
-        </w:tc>
-      </w:tr>
-      <w:tr>
-        <w:tc>
-          <w:tcPr>
-            <w:tcW w:type="dxa" w:w="3135"/>
-          </w:tcPr>
-          <w:p>
-            <w:r>
-              <w:rPr>
-                <w:sz w:val="20"/>
-              </w:rPr>
-              <w:t>statistics.py</w:t>
-            </w:r>
-          </w:p>
-        </w:tc>
-        <w:tc>
-          <w:tcPr>
-            <w:tcW w:type="dxa" w:w="3135"/>
-          </w:tcPr>
-          <w:p>
-            <w:r>
-              <w:rPr>
-                <w:sz w:val="20"/>
-              </w:rPr>
-              <w:t>Manvi</w:t>
-            </w:r>
-          </w:p>
-        </w:tc>
-        <w:tc>
-          <w:tcPr>
-            <w:tcW w:type="dxa" w:w="3135"/>
-          </w:tcPr>
-          <w:p>
-            <w:r>
-              <w:rPr>
-                <w:sz w:val="20"/>
-              </w:rPr>
-              <w:t>Not started</w:t>
-            </w:r>
-          </w:p>
-        </w:tc>
-      </w:tr>
-      <w:tr>
-        <w:tc>
-          <w:tcPr>
-            <w:tcW w:type="dxa" w:w="3135"/>
-          </w:tcPr>
-          <w:p>
-            <w:r>
-              <w:rPr>
-                <w:sz w:val="20"/>
-              </w:rPr>
-              <w:t>visualization.py</w:t>
-            </w:r>
-          </w:p>
-        </w:tc>
-        <w:tc>
-          <w:tcPr>
-            <w:tcW w:type="dxa" w:w="3135"/>
-          </w:tcPr>
-          <w:p>
-            <w:r>
-              <w:rPr>
-                <w:sz w:val="20"/>
-              </w:rPr>
-              <w:t>Sai</w:t>
-            </w:r>
-          </w:p>
-        </w:tc>
-        <w:tc>
-          <w:tcPr>
-            <w:tcW w:type="dxa" w:w="3135"/>
-          </w:tcPr>
-          <w:p>
-            <w:r>
-              <w:rPr>
-                <w:sz w:val="20"/>
-              </w:rPr>
-              <w:t>Not started</w:t>
-            </w:r>
-          </w:p>
-        </w:tc>
-      </w:tr>
-      <w:tr>
-        <w:tc>
-          <w:tcPr>
-            <w:tcW w:type="dxa" w:w="3135"/>
-          </w:tcPr>
-          <w:p>
-            <w:r>
-              <w:rPr>
-                <w:sz w:val="20"/>
-              </w:rPr>
-              <w:t>gui.py (full integration)</w:t>
-            </w:r>
-          </w:p>
-        </w:tc>
-        <w:tc>
-          <w:tcPr>
-            <w:tcW w:type="dxa" w:w="3135"/>
-          </w:tcPr>
-          <w:p>
-            <w:r>
-              <w:rPr>
-                <w:sz w:val="20"/>
-              </w:rPr>
-              <w:t>Daksha + Prathmesh</w:t>
-            </w:r>
-          </w:p>
-        </w:tc>
-        <w:tc>
-          <w:tcPr>
-            <w:tcW w:type="dxa" w:w="3135"/>
-          </w:tcPr>
-          <w:p>
-            <w:r>
-              <w:rPr>
-                <w:sz w:val="20"/>
-              </w:rPr>
-              <w:t>Not started</w:t>
-            </w:r>
-          </w:p>
-        </w:tc>
-      </w:tr>
-    </w:tbl>
-    <w:p/>
-    <w:p>
-      <w:pPr>
-        <w:pStyle w:val="Heading2"/>
+        <w:pStyle w:val="ListBullet"/>
       </w:pPr>
       <w:r>
         <w:rPr>
-          <w:color w:val="003366"/>
+          <w:rFonts w:ascii="Segoe UI" w:hAnsi="Segoe UI"/>
+          <w:b/>
+          <w:sz w:val="20"/>
         </w:rPr>
-        <w:t>Complete Pipeline Flow</w:t>
+        <w:t xml:space="preserve">Model Comparison Benchmarking: </w:t>
+      </w:r>
+      <w:r>
+        <w:rPr>
+          <w:rFonts w:ascii="Segoe UI" w:hAnsi="Segoe UI"/>
+          <w:sz w:val="20"/>
+        </w:rPr>
+        <w:t>Add benchmarking scripts in src/core/ to compare Logistic Regression performance against Random Forest, Naive Bayes, and Linear SVM.</w:t>
       </w:r>
     </w:p>
     <w:p>
       <w:pPr>
-        <w:spacing w:before="80" w:after="80"/>
+        <w:pStyle w:val="ListBullet"/>
       </w:pPr>
       <w:r>
         <w:rPr>
-          <w:rFonts w:ascii="Consolas" w:hAnsi="Consolas"/>
-          <w:color w:val="1E1E1E"/>
-          <w:sz w:val="18"/>
+          <w:rFonts w:ascii="Segoe UI" w:hAnsi="Segoe UI"/>
+          <w:b/>
+          <w:sz w:val="20"/>
         </w:rPr>
-        <w:t>CSV File (data/comments.csv)</w:t>
-        <w:br/>
-        <w:t xml:space="preserve">       |</w:t>
-        <w:br/>
-        <w:t xml:space="preserve">       v</w:t>
-        <w:br/>
-        <w:t>Pandas DataFrame</w:t>
-        <w:br/>
-        <w:t xml:space="preserve">       |</w:t>
-        <w:br/>
-        <w:t xml:space="preserve">       v</w:t>
-        <w:br/>
-        <w:t>Text Preprocessing (preprocessing.py)</w:t>
-        <w:br/>
-        <w:t xml:space="preserve">       |</w:t>
-        <w:br/>
-        <w:t xml:space="preserve">       v</w:t>
-        <w:br/>
-        <w:t>Cleaned Comments</w:t>
-        <w:br/>
-        <w:t xml:space="preserve">       |</w:t>
-        <w:br/>
-        <w:t xml:space="preserve">       v</w:t>
-        <w:br/>
-        <w:t>TF-IDF Vectorization (train_model.py)</w:t>
-        <w:br/>
-        <w:t xml:space="preserve">       |</w:t>
-        <w:br/>
-        <w:t xml:space="preserve">       v</w:t>
-        <w:br/>
-        <w:t>Numerical Feature Matrix</w:t>
-        <w:br/>
-        <w:t xml:space="preserve">       |</w:t>
-        <w:br/>
-        <w:t xml:space="preserve">       v</w:t>
-        <w:br/>
-        <w:t>Train/Test Split (80/20)</w:t>
-        <w:br/>
-        <w:t xml:space="preserve">       |</w:t>
-        <w:br/>
-        <w:t xml:space="preserve">       v</w:t>
-        <w:br/>
-        <w:t>Multinomial Naive Bayes Training</w:t>
-        <w:br/>
-        <w:t xml:space="preserve">       |</w:t>
-        <w:br/>
-        <w:t xml:space="preserve">       v</w:t>
-        <w:br/>
-        <w:t>Saved model.pkl + vectorizer.pkl</w:t>
-        <w:br/>
-        <w:t xml:space="preserve">       |</w:t>
-        <w:br/>
-        <w:t xml:space="preserve">       v</w:t>
-        <w:br/>
-        <w:t>User Input / CSV  --&gt;  Preprocessing  --&gt;  Vectorizer  --&gt;  Model Prediction</w:t>
-        <w:br/>
-        <w:t xml:space="preserve">       |</w:t>
-        <w:br/>
-        <w:t xml:space="preserve">       v</w:t>
-        <w:br/>
-        <w:t>Positive / Negative / Neutral</w:t>
-        <w:br/>
-        <w:t xml:space="preserve">       |</w:t>
-        <w:br/>
-        <w:t xml:space="preserve">       v</w:t>
-        <w:br/>
-        <w:t>Statistical Analysis (Manvi - pending)</w:t>
-        <w:br/>
-        <w:t xml:space="preserve">       |</w:t>
-        <w:br/>
-        <w:t xml:space="preserve">       v</w:t>
-        <w:br/>
-        <w:t>Pie Chart / Bar Chart / Dashboard (Sai - pending)</w:t>
-        <w:br/>
-        <w:t xml:space="preserve">       |</w:t>
-        <w:br/>
-        <w:t xml:space="preserve">       v</w:t>
-        <w:br/>
-        <w:t>Final Results Displayed in GUI (Daksha - pending)</w:t>
+        <w:t xml:space="preserve">Standalone Executable Build: </w:t>
       </w:r>
-    </w:p>
-    <w:p>
-      <w:pPr>
-        <w:pStyle w:val="Heading1"/>
-      </w:pPr>
       <w:r>
         <w:rPr>
-          <w:color w:val="003366"/>
+          <w:rFonts w:ascii="Segoe UI" w:hAnsi="Segoe UI"/>
+          <w:sz w:val="20"/>
         </w:rPr>
-        <w:t>9. How to Run</w:t>
-      </w:r>
-    </w:p>
-    <w:p>
-      <w:pPr>
-        <w:spacing w:after="120"/>
-      </w:pPr>
-      <w:r>
-        <w:t>Step 1: Install dependencies</w:t>
-      </w:r>
-    </w:p>
-    <w:p>
-      <w:pPr>
-        <w:spacing w:before="80" w:after="80"/>
-      </w:pPr>
-      <w:r>
-        <w:rPr>
-          <w:rFonts w:ascii="Consolas" w:hAnsi="Consolas"/>
-          <w:color w:val="1E1E1E"/>
-          <w:sz w:val="18"/>
-        </w:rPr>
-        <w:t>pip install -r requirements.txt</w:t>
-      </w:r>
-    </w:p>
-    <w:p>
-      <w:pPr>
-        <w:spacing w:after="120"/>
-      </w:pPr>
-      <w:r>
-        <w:t>Step 2: Train the model</w:t>
-      </w:r>
-    </w:p>
-    <w:p>
-      <w:pPr>
-        <w:spacing w:before="80" w:after="80"/>
-      </w:pPr>
-      <w:r>
-        <w:rPr>
-          <w:rFonts w:ascii="Consolas" w:hAnsi="Consolas"/>
-          <w:color w:val="1E1E1E"/>
-          <w:sz w:val="18"/>
-        </w:rPr>
-        <w:t>cd src</w:t>
-        <w:br/>
-        <w:t>python train_model.py</w:t>
-      </w:r>
-    </w:p>
-    <w:p>
-      <w:pPr>
-        <w:spacing w:after="120"/>
-      </w:pPr>
-      <w:r>
-        <w:t>Step 3: Test predictions</w:t>
-      </w:r>
-    </w:p>
-    <w:p>
-      <w:pPr>
-        <w:spacing w:before="80" w:after="80"/>
-      </w:pPr>
-      <w:r>
-        <w:rPr>
-          <w:rFonts w:ascii="Consolas" w:hAnsi="Consolas"/>
-          <w:color w:val="1E1E1E"/>
-          <w:sz w:val="18"/>
-        </w:rPr>
-        <w:t>python predict.py</w:t>
-      </w:r>
-    </w:p>
-    <w:p>
-      <w:pPr>
-        <w:spacing w:after="120"/>
-      </w:pPr>
-      <w:r>
-        <w:t>Step 4: Launch the GUI (basic upload only for now)</w:t>
-      </w:r>
-    </w:p>
-    <w:p>
-      <w:pPr>
-        <w:spacing w:before="80" w:after="80"/>
-      </w:pPr>
-      <w:r>
-        <w:rPr>
-          <w:rFonts w:ascii="Consolas" w:hAnsi="Consolas"/>
-          <w:color w:val="1E1E1E"/>
-          <w:sz w:val="18"/>
-        </w:rPr>
-        <w:t>python gui.py</w:t>
+        <w:t>Package the application using PyInstaller into a standalone Windows executable (.exe) for distribution to end-users without requiring Python installation.</w:t>
       </w:r>
     </w:p>
     <w:sectPr>
       <w:pgSz w:w="12240" w:h="15840"/>
-      <w:pgMar w:top="1134" w:right="1417" w:bottom="1134" w:left="1417" w:header="720" w:footer="720" w:gutter="0"/>
+      <w:pgMar w:top="1440" w:right="1800" w:bottom="1440" w:left="1800" w:header="720" w:footer="720" w:gutter="0"/>
       <w:cols w:space="720"/>
       <w:docGrid w:linePitch="360"/>
     </w:sectPr>
@@ -3468,10 +1468,6 @@
     <w:name w:val="Normal"/>
     <w:qFormat/>
     <w:rsid w:val="00FC693F"/>
-    <w:rPr>
-      <w:rFonts w:ascii="Calibri" w:hAnsi="Calibri"/>
-      <w:sz w:val="22"/>
-    </w:rPr>
   </w:style>
   <w:style w:type="paragraph" w:styleId="Header">
     <w:name w:val="header"/>

</xml_diff>

<commit_message>
docs: integrate Team Guide work breakdown into progress report index
</commit_message>
<xml_diff>
--- a/docs/Change_Report.docx
+++ b/docs/Change_Report.docx
@@ -12,7 +12,7 @@
           <w:color w:val="102C57"/>
           <w:sz w:val="48"/>
         </w:rPr>
-        <w:t>Social Media Sentiment Analysis: Master Progress Report &amp; Index</w:t>
+        <w:t>Social Media Sentiment Analysis: Master Progress Report &amp; Team Guide Index</w:t>
       </w:r>
     </w:p>
     <w:p>
@@ -25,6 +25,8 @@
           <w:color w:val="646464"/>
           <w:sz w:val="19"/>
         </w:rPr>
+        <w:t>Team Members: Rishabh, Swarni, Daksha, Prathamesh, Manvi, Sai</w:t>
+        <w:br/>
         <w:t>Timeline: Day 1 (2026-07-22) to Tomorrow (2026-07-30)</w:t>
         <w:br/>
         <w:t>Last Updated: 2026-07-29</w:t>
@@ -51,7 +53,7 @@
           <w:i w:val="0"/>
           <w:sz w:val="21"/>
         </w:rPr>
-        <w:t>This document provides a comprehensive chronological index of all development phases, architectural refactorings, machine learning model enhancements, UI iterations, and future roadmaps for the Social Media Sentiment Analysis project.</w:t>
+        <w:t>This document provides a comprehensive chronological index of all development phases, team member task allocations from the Team Guide (Pending_Work_Team_Guide.docx), machine learning model enhancements, UI iterations, and future roadmaps for the Social Media Sentiment Analysis project.</w:t>
       </w:r>
     </w:p>
     <w:p>
@@ -64,7 +66,7 @@
           <w:color w:val="35A29F"/>
           <w:sz w:val="26"/>
         </w:rPr>
-        <w:t>Report Index</w:t>
+        <w:t>Report Index Table</w:t>
       </w:r>
     </w:p>
     <w:tbl>
@@ -121,7 +123,7 @@
                 <w:b/>
                 <w:color w:val="FFFFFF"/>
               </w:rPr>
-              <w:t>Key Achievements</w:t>
+              <w:t>Key Achievements &amp; Team Allocations</w:t>
             </w:r>
           </w:p>
         </w:tc>
@@ -180,7 +182,7 @@
                 <w:rFonts w:ascii="Segoe UI" w:hAnsi="Segoe UI"/>
                 <w:sz w:val="19"/>
               </w:rPr>
-              <w:t>Repo setup, README framework, core requirements.txt</w:t>
+              <w:t>Repo setup, README framework, requirements.txt (Rishabh)</w:t>
             </w:r>
           </w:p>
         </w:tc>
@@ -224,7 +226,7 @@
                 <w:rFonts w:ascii="Segoe UI" w:hAnsi="Segoe UI"/>
                 <w:sz w:val="19"/>
               </w:rPr>
-              <w:t>Core ML Engine &amp; Prototype</w:t>
+              <w:t>Core ML Pipeline &amp; Team Guide</w:t>
             </w:r>
           </w:p>
         </w:tc>
@@ -238,7 +240,7 @@
                 <w:rFonts w:ascii="Segoe UI" w:hAnsi="Segoe UI"/>
                 <w:sz w:val="19"/>
               </w:rPr>
-              <w:t>Preprocessing, training, predict scripts, 100-comment test dataset</w:t>
+              <w:t>Preprocessing, training, predict scripts (Rishabh/Swarni), team guide creation</w:t>
             </w:r>
           </w:p>
         </w:tc>
@@ -282,7 +284,7 @@
                 <w:rFonts w:ascii="Segoe UI" w:hAnsi="Segoe UI"/>
                 <w:sz w:val="19"/>
               </w:rPr>
-              <w:t>GUI &amp; Team Contributions</w:t>
+              <w:t>GUI Layout &amp; Statistics</w:t>
             </w:r>
           </w:p>
         </w:tc>
@@ -296,7 +298,7 @@
                 <w:rFonts w:ascii="Segoe UI" w:hAnsi="Segoe UI"/>
                 <w:sz w:val="19"/>
               </w:rPr>
-              <w:t>GUI integration, multi-frame layout, statistics.py updates</w:t>
+              <w:t>statistics.py (Manvi), GUI layout (Daksha), backend wiring (Prathamesh)</w:t>
             </w:r>
           </w:p>
         </w:tc>
@@ -354,7 +356,7 @@
                 <w:rFonts w:ascii="Segoe UI" w:hAnsi="Segoe UI"/>
                 <w:sz w:val="19"/>
               </w:rPr>
-              <w:t>Logistic Regression + TF-IDF, 11k dataset generation, Model Explanation doc</w:t>
+              <w:t>Logistic Regression + TF-IDF, 11k dataset, Model Explanation doc (Rishabh)</w:t>
             </w:r>
           </w:p>
         </w:tc>
@@ -412,7 +414,7 @@
                 <w:rFonts w:ascii="Segoe UI" w:hAnsi="Segoe UI"/>
                 <w:sz w:val="19"/>
               </w:rPr>
-              <w:t>Clean src package structure, Tkinter dashboard, file/git cleanup</w:t>
+              <w:t>Clean package layout, Tkinter SentimentApp dashboard, file/git cleanup</w:t>
             </w:r>
           </w:p>
         </w:tc>
@@ -456,7 +458,7 @@
                 <w:rFonts w:ascii="Segoe UI" w:hAnsi="Segoe UI"/>
                 <w:sz w:val="19"/>
               </w:rPr>
-              <w:t>Production &amp; Standalone Executable</w:t>
+              <w:t>Production &amp; Standalone .exe</w:t>
             </w:r>
           </w:p>
         </w:tc>
@@ -501,7 +503,405 @@
           <w:color w:val="1E56A0"/>
           <w:sz w:val="32"/>
         </w:rPr>
-        <w:t>2. Day 1 (2026-07-22): Project Initialization</w:t>
+        <w:t>2. Team Member Work Breakdown (Team Guide)</w:t>
+      </w:r>
+    </w:p>
+    <w:p>
+      <w:r>
+        <w:rPr>
+          <w:rFonts w:ascii="Segoe UI" w:hAnsi="Segoe UI"/>
+          <w:b w:val="0"/>
+          <w:i w:val="0"/>
+          <w:sz w:val="21"/>
+        </w:rPr>
+        <w:t>Per the project architecture guide (Pending_Work_Team_Guide.docx), the system modules were distributed across team members as follows:</w:t>
+      </w:r>
+    </w:p>
+    <w:tbl>
+      <w:tblPr>
+        <w:tblW w:type="auto" w:w="0"/>
+        <w:jc w:val="center"/>
+        <w:tblLook w:firstColumn="1" w:firstRow="1" w:lastColumn="0" w:lastRow="0" w:noHBand="0" w:noVBand="1" w:val="04A0"/>
+      </w:tblPr>
+      <w:tblGrid>
+        <w:gridCol w:w="2160"/>
+        <w:gridCol w:w="2160"/>
+        <w:gridCol w:w="2160"/>
+        <w:gridCol w:w="2160"/>
+      </w:tblGrid>
+      <w:tr>
+        <w:tc>
+          <w:tcPr>
+            <w:tcW w:type="dxa" w:w="2160"/>
+            <w:shd w:val="clear" w:color="auto" w:fill="35A29F"/>
+          </w:tcPr>
+          <w:p>
+            <w:r>
+              <w:rPr>
+                <w:b/>
+                <w:color w:val="FFFFFF"/>
+              </w:rPr>
+              <w:t>Team Member</w:t>
+            </w:r>
+          </w:p>
+        </w:tc>
+        <w:tc>
+          <w:tcPr>
+            <w:tcW w:type="dxa" w:w="2160"/>
+            <w:shd w:val="clear" w:color="auto" w:fill="35A29F"/>
+          </w:tcPr>
+          <w:p>
+            <w:r>
+              <w:rPr>
+                <w:b/>
+                <w:color w:val="FFFFFF"/>
+              </w:rPr>
+              <w:t>Assigned Module / File</w:t>
+            </w:r>
+          </w:p>
+        </w:tc>
+        <w:tc>
+          <w:tcPr>
+            <w:tcW w:type="dxa" w:w="2160"/>
+            <w:shd w:val="clear" w:color="auto" w:fill="35A29F"/>
+          </w:tcPr>
+          <w:p>
+            <w:r>
+              <w:rPr>
+                <w:b/>
+                <w:color w:val="FFFFFF"/>
+              </w:rPr>
+              <w:t>Responsibilities &amp; Functions</w:t>
+            </w:r>
+          </w:p>
+        </w:tc>
+        <w:tc>
+          <w:tcPr>
+            <w:tcW w:type="dxa" w:w="2160"/>
+            <w:shd w:val="clear" w:color="auto" w:fill="35A29F"/>
+          </w:tcPr>
+          <w:p>
+            <w:r>
+              <w:rPr>
+                <w:b/>
+                <w:color w:val="FFFFFF"/>
+              </w:rPr>
+              <w:t>Module Status</w:t>
+            </w:r>
+          </w:p>
+        </w:tc>
+      </w:tr>
+      <w:tr>
+        <w:tc>
+          <w:tcPr>
+            <w:tcW w:type="dxa" w:w="2160"/>
+          </w:tcPr>
+          <w:p>
+            <w:r>
+              <w:rPr>
+                <w:rFonts w:ascii="Segoe UI" w:hAnsi="Segoe UI"/>
+                <w:sz w:val="19"/>
+              </w:rPr>
+              <w:t>Rishabh &amp; Swarni</w:t>
+            </w:r>
+          </w:p>
+        </w:tc>
+        <w:tc>
+          <w:tcPr>
+            <w:tcW w:type="dxa" w:w="2160"/>
+          </w:tcPr>
+          <w:p>
+            <w:r>
+              <w:rPr>
+                <w:rFonts w:ascii="Segoe UI" w:hAnsi="Segoe UI"/>
+                <w:sz w:val="19"/>
+              </w:rPr>
+              <w:t>src/core/preprocess.py</w:t>
+              <w:br/>
+              <w:t>src/core/train.py</w:t>
+              <w:br/>
+              <w:t>src/core/predict.py</w:t>
+            </w:r>
+          </w:p>
+        </w:tc>
+        <w:tc>
+          <w:tcPr>
+            <w:tcW w:type="dxa" w:w="2160"/>
+          </w:tcPr>
+          <w:p>
+            <w:r>
+              <w:rPr>
+                <w:rFonts w:ascii="Segoe UI" w:hAnsi="Segoe UI"/>
+                <w:sz w:val="19"/>
+              </w:rPr>
+              <w:t>Built regex text cleaner, stop-word filtering, TF-IDF vectorizer, Logistic Regression model trainer, and inference functions.</w:t>
+            </w:r>
+          </w:p>
+        </w:tc>
+        <w:tc>
+          <w:tcPr>
+            <w:tcW w:type="dxa" w:w="2160"/>
+          </w:tcPr>
+          <w:p>
+            <w:r>
+              <w:rPr>
+                <w:rFonts w:ascii="Segoe UI" w:hAnsi="Segoe UI"/>
+                <w:sz w:val="19"/>
+              </w:rPr>
+              <w:t>Completed</w:t>
+            </w:r>
+          </w:p>
+        </w:tc>
+      </w:tr>
+      <w:tr>
+        <w:tc>
+          <w:tcPr>
+            <w:tcW w:type="dxa" w:w="2160"/>
+          </w:tcPr>
+          <w:p>
+            <w:r>
+              <w:rPr>
+                <w:rFonts w:ascii="Segoe UI" w:hAnsi="Segoe UI"/>
+                <w:sz w:val="19"/>
+              </w:rPr>
+              <w:t>Manvi</w:t>
+            </w:r>
+          </w:p>
+        </w:tc>
+        <w:tc>
+          <w:tcPr>
+            <w:tcW w:type="dxa" w:w="2160"/>
+          </w:tcPr>
+          <w:p>
+            <w:r>
+              <w:rPr>
+                <w:rFonts w:ascii="Segoe UI" w:hAnsi="Segoe UI"/>
+                <w:sz w:val="19"/>
+              </w:rPr>
+              <w:t>src/analytics/statistics.py</w:t>
+            </w:r>
+          </w:p>
+        </w:tc>
+        <w:tc>
+          <w:tcPr>
+            <w:tcW w:type="dxa" w:w="2160"/>
+          </w:tcPr>
+          <w:p>
+            <w:r>
+              <w:rPr>
+                <w:rFonts w:ascii="Segoe UI" w:hAnsi="Segoe UI"/>
+                <w:sz w:val="19"/>
+              </w:rPr>
+              <w:t>Built compute_statistics() calculating sentiment counts (pos/neg/neu), percentages, text length stats, and frequency distribution tables.</w:t>
+            </w:r>
+          </w:p>
+        </w:tc>
+        <w:tc>
+          <w:tcPr>
+            <w:tcW w:type="dxa" w:w="2160"/>
+          </w:tcPr>
+          <w:p>
+            <w:r>
+              <w:rPr>
+                <w:rFonts w:ascii="Segoe UI" w:hAnsi="Segoe UI"/>
+                <w:sz w:val="19"/>
+              </w:rPr>
+              <w:t>Completed</w:t>
+            </w:r>
+          </w:p>
+        </w:tc>
+      </w:tr>
+      <w:tr>
+        <w:tc>
+          <w:tcPr>
+            <w:tcW w:type="dxa" w:w="2160"/>
+          </w:tcPr>
+          <w:p>
+            <w:r>
+              <w:rPr>
+                <w:rFonts w:ascii="Segoe UI" w:hAnsi="Segoe UI"/>
+                <w:sz w:val="19"/>
+              </w:rPr>
+              <w:t>Sai</w:t>
+            </w:r>
+          </w:p>
+        </w:tc>
+        <w:tc>
+          <w:tcPr>
+            <w:tcW w:type="dxa" w:w="2160"/>
+          </w:tcPr>
+          <w:p>
+            <w:r>
+              <w:rPr>
+                <w:rFonts w:ascii="Segoe UI" w:hAnsi="Segoe UI"/>
+                <w:sz w:val="19"/>
+              </w:rPr>
+              <w:t>src/analytics/visualization.py</w:t>
+            </w:r>
+          </w:p>
+        </w:tc>
+        <w:tc>
+          <w:tcPr>
+            <w:tcW w:type="dxa" w:w="2160"/>
+          </w:tcPr>
+          <w:p>
+            <w:r>
+              <w:rPr>
+                <w:rFonts w:ascii="Segoe UI" w:hAnsi="Segoe UI"/>
+                <w:sz w:val="19"/>
+              </w:rPr>
+              <w:t>Built Matplotlib chart generators (create_pie_chart, create_bar_chart, create_histogram) for visual analysis.</w:t>
+            </w:r>
+          </w:p>
+        </w:tc>
+        <w:tc>
+          <w:tcPr>
+            <w:tcW w:type="dxa" w:w="2160"/>
+          </w:tcPr>
+          <w:p>
+            <w:r>
+              <w:rPr>
+                <w:rFonts w:ascii="Segoe UI" w:hAnsi="Segoe UI"/>
+                <w:sz w:val="19"/>
+              </w:rPr>
+              <w:t>Completed (Optional/Independent)</w:t>
+            </w:r>
+          </w:p>
+        </w:tc>
+      </w:tr>
+      <w:tr>
+        <w:tc>
+          <w:tcPr>
+            <w:tcW w:type="dxa" w:w="2160"/>
+          </w:tcPr>
+          <w:p>
+            <w:r>
+              <w:rPr>
+                <w:rFonts w:ascii="Segoe UI" w:hAnsi="Segoe UI"/>
+                <w:sz w:val="19"/>
+              </w:rPr>
+              <w:t>Daksha</w:t>
+            </w:r>
+          </w:p>
+        </w:tc>
+        <w:tc>
+          <w:tcPr>
+            <w:tcW w:type="dxa" w:w="2160"/>
+          </w:tcPr>
+          <w:p>
+            <w:r>
+              <w:rPr>
+                <w:rFonts w:ascii="Segoe UI" w:hAnsi="Segoe UI"/>
+                <w:sz w:val="19"/>
+              </w:rPr>
+              <w:t>src/ui/ui_manager.py</w:t>
+              <w:br/>
+              <w:t>(legacy src/gui.py)</w:t>
+            </w:r>
+          </w:p>
+        </w:tc>
+        <w:tc>
+          <w:tcPr>
+            <w:tcW w:type="dxa" w:w="2160"/>
+          </w:tcPr>
+          <w:p>
+            <w:r>
+              <w:rPr>
+                <w:rFonts w:ascii="Segoe UI" w:hAnsi="Segoe UI"/>
+                <w:sz w:val="19"/>
+              </w:rPr>
+              <w:t>Designed desktop GUI window layout, frame navigation (Home, Results, Graph views), title headers, cards, and buttons.</w:t>
+            </w:r>
+          </w:p>
+        </w:tc>
+        <w:tc>
+          <w:tcPr>
+            <w:tcW w:type="dxa" w:w="2160"/>
+          </w:tcPr>
+          <w:p>
+            <w:r>
+              <w:rPr>
+                <w:rFonts w:ascii="Segoe UI" w:hAnsi="Segoe UI"/>
+                <w:sz w:val="19"/>
+              </w:rPr>
+              <w:t>Completed</w:t>
+            </w:r>
+          </w:p>
+        </w:tc>
+      </w:tr>
+      <w:tr>
+        <w:tc>
+          <w:tcPr>
+            <w:tcW w:type="dxa" w:w="2160"/>
+          </w:tcPr>
+          <w:p>
+            <w:r>
+              <w:rPr>
+                <w:rFonts w:ascii="Segoe UI" w:hAnsi="Segoe UI"/>
+                <w:sz w:val="19"/>
+              </w:rPr>
+              <w:t>Prathamesh</w:t>
+            </w:r>
+          </w:p>
+        </w:tc>
+        <w:tc>
+          <w:tcPr>
+            <w:tcW w:type="dxa" w:w="2160"/>
+          </w:tcPr>
+          <w:p>
+            <w:r>
+              <w:rPr>
+                <w:rFonts w:ascii="Segoe UI" w:hAnsi="Segoe UI"/>
+                <w:sz w:val="19"/>
+              </w:rPr>
+              <w:t>src/ui/ui_manager.py</w:t>
+              <w:br/>
+              <w:t>(backend wiring)</w:t>
+            </w:r>
+          </w:p>
+        </w:tc>
+        <w:tc>
+          <w:tcPr>
+            <w:tcW w:type="dxa" w:w="2160"/>
+          </w:tcPr>
+          <w:p>
+            <w:r>
+              <w:rPr>
+                <w:rFonts w:ascii="Segoe UI" w:hAnsi="Segoe UI"/>
+                <w:sz w:val="19"/>
+              </w:rPr>
+              <w:t>Wired GUI buttons to predict.py, statistics.py, and CSV file upload handling.</w:t>
+            </w:r>
+          </w:p>
+        </w:tc>
+        <w:tc>
+          <w:tcPr>
+            <w:tcW w:type="dxa" w:w="2160"/>
+          </w:tcPr>
+          <w:p>
+            <w:r>
+              <w:rPr>
+                <w:rFonts w:ascii="Segoe UI" w:hAnsi="Segoe UI"/>
+                <w:sz w:val="19"/>
+              </w:rPr>
+              <w:t>Completed</w:t>
+            </w:r>
+          </w:p>
+        </w:tc>
+      </w:tr>
+    </w:tbl>
+    <w:p/>
+    <w:p>
+      <w:pPr>
+        <w:pStyle w:val="Heading1"/>
+      </w:pPr>
+      <w:r>
+        <w:rPr>
+          <w:b/>
+          <w:color w:val="1E56A0"/>
+          <w:sz w:val="32"/>
+        </w:rPr>
+        <w:t>3. Day 1 (2026-07-22): Project Initialization</w:t>
       </w:r>
     </w:p>
     <w:p>
@@ -585,7 +985,7 @@
           <w:color w:val="1E56A0"/>
           <w:sz w:val="32"/>
         </w:rPr>
-        <w:t>3. Day 2 (2026-07-26): Core ML Engine &amp; Prototype</w:t>
+        <w:t>4. Day 2 (2026-07-26): Core ML Pipeline &amp; Team Guide</w:t>
       </w:r>
     </w:p>
     <w:p>
@@ -669,34 +1069,14 @@
           <w:b/>
           <w:sz w:val="20"/>
         </w:rPr>
-        <w:t xml:space="preserve">Teamwork Guide: </w:t>
+        <w:t xml:space="preserve">Team Work Guide Creation: </w:t>
       </w:r>
       <w:r>
         <w:rPr>
           <w:rFonts w:ascii="Segoe UI" w:hAnsi="Segoe UI"/>
           <w:sz w:val="20"/>
         </w:rPr>
-        <w:t>Created Pending_Work_Team_Guide.docx detailing sub-task breakdowns for team contributors.</w:t>
-      </w:r>
-    </w:p>
-    <w:p>
-      <w:pPr>
-        <w:pStyle w:val="ListBullet"/>
-      </w:pPr>
-      <w:r>
-        <w:rPr>
-          <w:rFonts w:ascii="Segoe UI" w:hAnsi="Segoe UI"/>
-          <w:b/>
-          <w:sz w:val="20"/>
-        </w:rPr>
-        <w:t xml:space="preserve">Analytics Module: </w:t>
-      </w:r>
-      <w:r>
-        <w:rPr>
-          <w:rFonts w:ascii="Segoe UI" w:hAnsi="Segoe UI"/>
-          <w:sz w:val="20"/>
-        </w:rPr>
-        <w:t>Integrated statistics.py contributed by team member manvi-afk for frequency distribution tables.</w:t>
+        <w:t>Created Pending_Work_Team_Guide.docx detailing sub-task breakdowns for team contributors (Manvi, Sai, Daksha, Prathamesh).</w:t>
       </w:r>
     </w:p>
     <w:p>
@@ -709,7 +1089,7 @@
           <w:color w:val="1E56A0"/>
           <w:sz w:val="32"/>
         </w:rPr>
-        <w:t>4. Day 3 (2026-07-27): GUI Integration &amp; Collaboration</w:t>
+        <w:t>5. Day 3 (2026-07-27): GUI Integration &amp; Collaboration</w:t>
       </w:r>
     </w:p>
     <w:p>
@@ -733,14 +1113,14 @@
           <w:b/>
           <w:sz w:val="20"/>
         </w:rPr>
-        <w:t xml:space="preserve">GUI Prototype: </w:t>
+        <w:t xml:space="preserve">Statistics Module (Manvi): </w:t>
       </w:r>
       <w:r>
         <w:rPr>
           <w:rFonts w:ascii="Segoe UI" w:hAnsi="Segoe UI"/>
           <w:sz w:val="20"/>
         </w:rPr>
-        <w:t>Integrated GUI code contributed by team member dakshadagale establishing home and results screen frames.</w:t>
+        <w:t>Integrated statistics.py computing positive, negative, and neutral percentages and frequencies.</w:t>
       </w:r>
     </w:p>
     <w:p>
@@ -753,14 +1133,34 @@
           <w:b/>
           <w:sz w:val="20"/>
         </w:rPr>
-        <w:t xml:space="preserve">File Picker &amp; Manual Entry: </w:t>
+        <w:t xml:space="preserve">Visualization Module (Sai): </w:t>
       </w:r>
       <w:r>
         <w:rPr>
           <w:rFonts w:ascii="Segoe UI" w:hAnsi="Segoe UI"/>
           <w:sz w:val="20"/>
         </w:rPr>
-        <w:t>Added file dialog support for CSV uploads and initial text boxes for comment entry.</w:t>
+        <w:t>Created Matplotlib visualization.py module with pie chart, bar chart, and length histogram functions.</w:t>
+      </w:r>
+    </w:p>
+    <w:p>
+      <w:pPr>
+        <w:pStyle w:val="ListBullet"/>
+      </w:pPr>
+      <w:r>
+        <w:rPr>
+          <w:rFonts w:ascii="Segoe UI" w:hAnsi="Segoe UI"/>
+          <w:b/>
+          <w:sz w:val="20"/>
+        </w:rPr>
+        <w:t xml:space="preserve">GUI Prototype (Daksha &amp; Prathamesh): </w:t>
+      </w:r>
+      <w:r>
+        <w:rPr>
+          <w:rFonts w:ascii="Segoe UI" w:hAnsi="Segoe UI"/>
+          <w:sz w:val="20"/>
+        </w:rPr>
+        <w:t>Integrated GUI layout and button handlers for CSV uploading and statistical displays.</w:t>
       </w:r>
     </w:p>
     <w:p>
@@ -773,7 +1173,7 @@
           <w:color w:val="1E56A0"/>
           <w:sz w:val="32"/>
         </w:rPr>
-        <w:t>5. Day 4 (2026-07-28): Model Upgrade &amp; 11,000 Comment Dataset</w:t>
+        <w:t>6. Day 4 (2026-07-28): Model Upgrade &amp; 11,000 Comment Dataset</w:t>
       </w:r>
     </w:p>
     <w:p>
@@ -877,7 +1277,7 @@
           <w:color w:val="1E56A0"/>
           <w:sz w:val="32"/>
         </w:rPr>
-        <w:t>6. Day 5 Today (2026-07-29): Modular Architecture &amp; Modern UI Redesign</w:t>
+        <w:t>7. Day 5 Today (2026-07-29): Modular Architecture &amp; Modern UI Redesign</w:t>
       </w:r>
     </w:p>
     <w:p>
@@ -1001,7 +1401,7 @@
           <w:color w:val="1E56A0"/>
           <w:sz w:val="32"/>
         </w:rPr>
-        <w:t>7. Day 6 Tomorrow (2026-07-30+): Production Distribution &amp; Future Roadmap</w:t>
+        <w:t>8. Day 6 Tomorrow (2026-07-30+): Production Distribution &amp; Future Roadmap</w:t>
       </w:r>
     </w:p>
     <w:p>

</xml_diff>

<commit_message>
docs: streamline documentation and remove internal guide
</commit_message>
<xml_diff>
--- a/docs/Change_Report.docx
+++ b/docs/Change_Report.docx
@@ -12,7 +12,7 @@
           <w:color w:val="102C57"/>
           <w:sz w:val="48"/>
         </w:rPr>
-        <w:t>Social Media Sentiment Analysis: Master Progress Report &amp; Team Guide Index</w:t>
+        <w:t>Social Media Sentiment Analysis: Master Progress Report &amp; System Index</w:t>
       </w:r>
     </w:p>
     <w:p>
@@ -25,8 +25,6 @@
           <w:color w:val="646464"/>
           <w:sz w:val="19"/>
         </w:rPr>
-        <w:t>Team Members: Rishabh, Swarni, Daksha, Prathamesh, Manvi, Sai</w:t>
-        <w:br/>
         <w:t>Timeline: Day 1 (2026-07-22) to Tomorrow (2026-07-30)</w:t>
         <w:br/>
         <w:t>Last Updated: 2026-07-29</w:t>
@@ -42,7 +40,7 @@
           <w:color w:val="1E56A0"/>
           <w:sz w:val="32"/>
         </w:rPr>
-        <w:t>1. Executive Overview &amp; Index</w:t>
+        <w:t>1. Executive Overview &amp; System Architecture</w:t>
       </w:r>
     </w:p>
     <w:p>
@@ -53,7 +51,7 @@
           <w:i w:val="0"/>
           <w:sz w:val="21"/>
         </w:rPr>
-        <w:t>This document provides a comprehensive chronological index of all development phases, team member task allocations from the Team Guide (Pending_Work_Team_Guide.docx), machine learning model enhancements, UI iterations, and future roadmaps for the Social Media Sentiment Analysis project.</w:t>
+        <w:t>This document provides an executive summary and progress report of the development phases, machine learning model enhancements, UI iterations, and technical roadmaps for the Social Media Sentiment Analysis application.</w:t>
       </w:r>
     </w:p>
     <w:p>
@@ -66,7 +64,7 @@
           <w:color w:val="35A29F"/>
           <w:sz w:val="26"/>
         </w:rPr>
-        <w:t>Report Index Table</w:t>
+        <w:t>Project Milestone Index</w:t>
       </w:r>
     </w:p>
     <w:tbl>
@@ -123,7 +121,7 @@
                 <w:b/>
                 <w:color w:val="FFFFFF"/>
               </w:rPr>
-              <w:t>Key Achievements &amp; Team Allocations</w:t>
+              <w:t>Key Achievements &amp; Deliverables</w:t>
             </w:r>
           </w:p>
         </w:tc>
@@ -182,7 +180,7 @@
                 <w:rFonts w:ascii="Segoe UI" w:hAnsi="Segoe UI"/>
                 <w:sz w:val="19"/>
               </w:rPr>
-              <w:t>Repo setup, README framework, requirements.txt (Rishabh)</w:t>
+              <w:t>Repo setup, README framework, requirements.txt</w:t>
             </w:r>
           </w:p>
         </w:tc>
@@ -226,7 +224,7 @@
                 <w:rFonts w:ascii="Segoe UI" w:hAnsi="Segoe UI"/>
                 <w:sz w:val="19"/>
               </w:rPr>
-              <w:t>Core ML Pipeline &amp; Team Guide</w:t>
+              <w:t>Core ML Pipeline Engine</w:t>
             </w:r>
           </w:p>
         </w:tc>
@@ -240,7 +238,7 @@
                 <w:rFonts w:ascii="Segoe UI" w:hAnsi="Segoe UI"/>
                 <w:sz w:val="19"/>
               </w:rPr>
-              <w:t>Preprocessing, training, predict scripts (Rishabh/Swarni), team guide creation</w:t>
+              <w:t>Preprocessing, training, predict scripts, 100-comment test dataset</w:t>
             </w:r>
           </w:p>
         </w:tc>
@@ -284,7 +282,7 @@
                 <w:rFonts w:ascii="Segoe UI" w:hAnsi="Segoe UI"/>
                 <w:sz w:val="19"/>
               </w:rPr>
-              <w:t>GUI Layout &amp; Statistics</w:t>
+              <w:t>GUI Layout &amp; Analytics</w:t>
             </w:r>
           </w:p>
         </w:tc>
@@ -298,7 +296,7 @@
                 <w:rFonts w:ascii="Segoe UI" w:hAnsi="Segoe UI"/>
                 <w:sz w:val="19"/>
               </w:rPr>
-              <w:t>statistics.py (Manvi), GUI layout (Daksha), backend wiring (Prathamesh)</w:t>
+              <w:t>statistics.py integration, GUI layout, backend event wiring</w:t>
             </w:r>
           </w:p>
         </w:tc>
@@ -356,7 +354,7 @@
                 <w:rFonts w:ascii="Segoe UI" w:hAnsi="Segoe UI"/>
                 <w:sz w:val="19"/>
               </w:rPr>
-              <w:t>Logistic Regression + TF-IDF, 11k dataset, Model Explanation doc (Rishabh)</w:t>
+              <w:t>Logistic Regression + TF-IDF, 11k dataset, Model Explanation doc</w:t>
             </w:r>
           </w:p>
         </w:tc>
@@ -503,7 +501,7 @@
           <w:color w:val="1E56A0"/>
           <w:sz w:val="32"/>
         </w:rPr>
-        <w:t>2. Team Member Work Breakdown (Team Guide)</w:t>
+        <w:t>2. System Package Architecture</w:t>
       </w:r>
     </w:p>
     <w:p>
@@ -514,7 +512,7 @@
           <w:i w:val="0"/>
           <w:sz w:val="21"/>
         </w:rPr>
-        <w:t>Per the project architecture guide (Pending_Work_Team_Guide.docx), the system modules were distributed across team members as follows:</w:t>
+        <w:t>The application follows a modular, decoupled Python architecture organized across distinct functional packages:</w:t>
       </w:r>
     </w:p>
     <w:tbl>
@@ -541,7 +539,7 @@
                 <w:b/>
                 <w:color w:val="FFFFFF"/>
               </w:rPr>
-              <w:t>Team Member</w:t>
+              <w:t>Package</w:t>
             </w:r>
           </w:p>
         </w:tc>
@@ -556,7 +554,7 @@
                 <w:b/>
                 <w:color w:val="FFFFFF"/>
               </w:rPr>
-              <w:t>Assigned Module / File</w:t>
+              <w:t>Module Files</w:t>
             </w:r>
           </w:p>
         </w:tc>
@@ -571,7 +569,7 @@
                 <w:b/>
                 <w:color w:val="FFFFFF"/>
               </w:rPr>
-              <w:t>Responsibilities &amp; Functions</w:t>
+              <w:t>Core Responsibilities &amp; Capabilities</w:t>
             </w:r>
           </w:p>
         </w:tc>
@@ -586,7 +584,7 @@
                 <w:b/>
                 <w:color w:val="FFFFFF"/>
               </w:rPr>
-              <w:t>Module Status</w:t>
+              <w:t>Status</w:t>
             </w:r>
           </w:p>
         </w:tc>
@@ -602,7 +600,7 @@
                 <w:rFonts w:ascii="Segoe UI" w:hAnsi="Segoe UI"/>
                 <w:sz w:val="19"/>
               </w:rPr>
-              <w:t>Rishabh &amp; Swarni</w:t>
+              <w:t>src/core</w:t>
             </w:r>
           </w:p>
         </w:tc>
@@ -616,11 +614,15 @@
                 <w:rFonts w:ascii="Segoe UI" w:hAnsi="Segoe UI"/>
                 <w:sz w:val="19"/>
               </w:rPr>
-              <w:t>src/core/preprocess.py</w:t>
+              <w:t>preprocess.py</w:t>
               <w:br/>
-              <w:t>src/core/train.py</w:t>
+              <w:t>train.py</w:t>
               <w:br/>
-              <w:t>src/core/predict.py</w:t>
+              <w:t>predict.py</w:t>
+              <w:br/>
+              <w:t>model_manager.py</w:t>
+              <w:br/>
+              <w:t>pipeline.py</w:t>
             </w:r>
           </w:p>
         </w:tc>
@@ -634,7 +636,7 @@
                 <w:rFonts w:ascii="Segoe UI" w:hAnsi="Segoe UI"/>
                 <w:sz w:val="19"/>
               </w:rPr>
-              <w:t>Built regex text cleaner, stop-word filtering, TF-IDF vectorizer, Logistic Regression model trainer, and inference functions.</w:t>
+              <w:t>Handles regex text cleaning, stop-word removal, TF-IDF vectorization, Logistic Regression model lifecycle, and end-to-end execution pipeline.</w:t>
             </w:r>
           </w:p>
         </w:tc>
@@ -664,7 +666,7 @@
                 <w:rFonts w:ascii="Segoe UI" w:hAnsi="Segoe UI"/>
                 <w:sz w:val="19"/>
               </w:rPr>
-              <w:t>Manvi</w:t>
+              <w:t>src/analytics</w:t>
             </w:r>
           </w:p>
         </w:tc>
@@ -678,7 +680,7 @@
                 <w:rFonts w:ascii="Segoe UI" w:hAnsi="Segoe UI"/>
                 <w:sz w:val="19"/>
               </w:rPr>
-              <w:t>src/analytics/statistics.py</w:t>
+              <w:t>statistics.py</w:t>
             </w:r>
           </w:p>
         </w:tc>
@@ -692,7 +694,7 @@
                 <w:rFonts w:ascii="Segoe UI" w:hAnsi="Segoe UI"/>
                 <w:sz w:val="19"/>
               </w:rPr>
-              <w:t>Built compute_statistics() calculating sentiment counts (pos/neg/neu), percentages, text length stats, and frequency distribution tables.</w:t>
+              <w:t>Computes total comment counts, positive/negative/neutral distribution ratios, text length metrics, and frequency distribution tables.</w:t>
             </w:r>
           </w:p>
         </w:tc>
@@ -722,7 +724,7 @@
                 <w:rFonts w:ascii="Segoe UI" w:hAnsi="Segoe UI"/>
                 <w:sz w:val="19"/>
               </w:rPr>
-              <w:t>Sai</w:t>
+              <w:t>src/ui</w:t>
             </w:r>
           </w:p>
         </w:tc>
@@ -736,7 +738,9 @@
                 <w:rFonts w:ascii="Segoe UI" w:hAnsi="Segoe UI"/>
                 <w:sz w:val="19"/>
               </w:rPr>
-              <w:t>src/analytics/visualization.py</w:t>
+              <w:t>ui_manager.py</w:t>
+              <w:br/>
+              <w:t>app.py</w:t>
             </w:r>
           </w:p>
         </w:tc>
@@ -750,67 +754,7 @@
                 <w:rFonts w:ascii="Segoe UI" w:hAnsi="Segoe UI"/>
                 <w:sz w:val="19"/>
               </w:rPr>
-              <w:t>Built Matplotlib chart generators (create_pie_chart, create_bar_chart, create_histogram) for visual analysis.</w:t>
-            </w:r>
-          </w:p>
-        </w:tc>
-        <w:tc>
-          <w:tcPr>
-            <w:tcW w:type="dxa" w:w="2160"/>
-          </w:tcPr>
-          <w:p>
-            <w:r>
-              <w:rPr>
-                <w:rFonts w:ascii="Segoe UI" w:hAnsi="Segoe UI"/>
-                <w:sz w:val="19"/>
-              </w:rPr>
-              <w:t>Completed (Optional/Independent)</w:t>
-            </w:r>
-          </w:p>
-        </w:tc>
-      </w:tr>
-      <w:tr>
-        <w:tc>
-          <w:tcPr>
-            <w:tcW w:type="dxa" w:w="2160"/>
-          </w:tcPr>
-          <w:p>
-            <w:r>
-              <w:rPr>
-                <w:rFonts w:ascii="Segoe UI" w:hAnsi="Segoe UI"/>
-                <w:sz w:val="19"/>
-              </w:rPr>
-              <w:t>Daksha</w:t>
-            </w:r>
-          </w:p>
-        </w:tc>
-        <w:tc>
-          <w:tcPr>
-            <w:tcW w:type="dxa" w:w="2160"/>
-          </w:tcPr>
-          <w:p>
-            <w:r>
-              <w:rPr>
-                <w:rFonts w:ascii="Segoe UI" w:hAnsi="Segoe UI"/>
-                <w:sz w:val="19"/>
-              </w:rPr>
-              <w:t>src/ui/ui_manager.py</w:t>
-              <w:br/>
-              <w:t>(legacy src/gui.py)</w:t>
-            </w:r>
-          </w:p>
-        </w:tc>
-        <w:tc>
-          <w:tcPr>
-            <w:tcW w:type="dxa" w:w="2160"/>
-          </w:tcPr>
-          <w:p>
-            <w:r>
-              <w:rPr>
-                <w:rFonts w:ascii="Segoe UI" w:hAnsi="Segoe UI"/>
-                <w:sz w:val="19"/>
-              </w:rPr>
-              <w:t>Designed desktop GUI window layout, frame navigation (Home, Results, Graph views), title headers, cards, and buttons.</w:t>
+              <w:t>Provides a Tkinter desktop GUI (SentimentApp) with home landing view, stat cards, interactive data treeviews, and non-blocking background threading.</w:t>
             </w:r>
           </w:p>
         </w:tc>
@@ -840,7 +784,7 @@
                 <w:rFonts w:ascii="Segoe UI" w:hAnsi="Segoe UI"/>
                 <w:sz w:val="19"/>
               </w:rPr>
-              <w:t>Prathamesh</w:t>
+              <w:t>src/utils</w:t>
             </w:r>
           </w:p>
         </w:tc>
@@ -854,9 +798,11 @@
                 <w:rFonts w:ascii="Segoe UI" w:hAnsi="Segoe UI"/>
                 <w:sz w:val="19"/>
               </w:rPr>
-              <w:t>src/ui/ui_manager.py</w:t>
+              <w:t>helpers.py</w:t>
               <w:br/>
-              <w:t>(backend wiring)</w:t>
+              <w:t>create_doc.py</w:t>
+              <w:br/>
+              <w:t>create_change_report.py</w:t>
             </w:r>
           </w:p>
         </w:tc>
@@ -870,7 +816,7 @@
                 <w:rFonts w:ascii="Segoe UI" w:hAnsi="Segoe UI"/>
                 <w:sz w:val="19"/>
               </w:rPr>
-              <w:t>Wired GUI buttons to predict.py, statistics.py, and CSV file upload handling.</w:t>
+              <w:t>Provides synthetic data generators, docx report compilation scripts, and utility helpers.</w:t>
             </w:r>
           </w:p>
         </w:tc>
@@ -985,7 +931,7 @@
           <w:color w:val="1E56A0"/>
           <w:sz w:val="32"/>
         </w:rPr>
-        <w:t>4. Day 2 (2026-07-26): Core ML Pipeline &amp; Team Guide</w:t>
+        <w:t>4. Day 2 (2026-07-26): Core ML Pipeline Engine</w:t>
       </w:r>
     </w:p>
     <w:p>
@@ -1061,26 +1007,6 @@
     </w:p>
     <w:p>
       <w:pPr>
-        <w:pStyle w:val="ListBullet"/>
-      </w:pPr>
-      <w:r>
-        <w:rPr>
-          <w:rFonts w:ascii="Segoe UI" w:hAnsi="Segoe UI"/>
-          <w:b/>
-          <w:sz w:val="20"/>
-        </w:rPr>
-        <w:t xml:space="preserve">Team Work Guide Creation: </w:t>
-      </w:r>
-      <w:r>
-        <w:rPr>
-          <w:rFonts w:ascii="Segoe UI" w:hAnsi="Segoe UI"/>
-          <w:sz w:val="20"/>
-        </w:rPr>
-        <w:t>Created Pending_Work_Team_Guide.docx detailing sub-task breakdowns for team contributors (Manvi, Sai, Daksha, Prathamesh).</w:t>
-      </w:r>
-    </w:p>
-    <w:p>
-      <w:pPr>
         <w:pStyle w:val="Heading1"/>
       </w:pPr>
       <w:r>
@@ -1089,7 +1015,7 @@
           <w:color w:val="1E56A0"/>
           <w:sz w:val="32"/>
         </w:rPr>
-        <w:t>5. Day 3 (2026-07-27): GUI Integration &amp; Collaboration</w:t>
+        <w:t>5. Day 3 (2026-07-27): GUI Integration &amp; Analytics</w:t>
       </w:r>
     </w:p>
     <w:p>
@@ -1100,7 +1026,7 @@
           <w:i w:val="0"/>
           <w:sz w:val="21"/>
         </w:rPr>
-        <w:t>Day 3 brought initial graphical user interface development and team code integration.</w:t>
+        <w:t>Day 3 brought initial graphical user interface development and statistical integration.</w:t>
       </w:r>
     </w:p>
     <w:p>
@@ -1113,7 +1039,7 @@
           <w:b/>
           <w:sz w:val="20"/>
         </w:rPr>
-        <w:t xml:space="preserve">Statistics Module (Manvi): </w:t>
+        <w:t xml:space="preserve">Statistics Module: </w:t>
       </w:r>
       <w:r>
         <w:rPr>
@@ -1133,27 +1059,7 @@
           <w:b/>
           <w:sz w:val="20"/>
         </w:rPr>
-        <w:t xml:space="preserve">Visualization Module (Sai): </w:t>
-      </w:r>
-      <w:r>
-        <w:rPr>
-          <w:rFonts w:ascii="Segoe UI" w:hAnsi="Segoe UI"/>
-          <w:sz w:val="20"/>
-        </w:rPr>
-        <w:t>Created Matplotlib visualization.py module with pie chart, bar chart, and length histogram functions.</w:t>
-      </w:r>
-    </w:p>
-    <w:p>
-      <w:pPr>
-        <w:pStyle w:val="ListBullet"/>
-      </w:pPr>
-      <w:r>
-        <w:rPr>
-          <w:rFonts w:ascii="Segoe UI" w:hAnsi="Segoe UI"/>
-          <w:b/>
-          <w:sz w:val="20"/>
-        </w:rPr>
-        <w:t xml:space="preserve">GUI Prototype (Daksha &amp; Prathamesh): </w:t>
+        <w:t xml:space="preserve">GUI Prototype: </w:t>
       </w:r>
       <w:r>
         <w:rPr>

</xml_diff>

<commit_message>
docs: clean up report phrasing and polish dashboard interface text
</commit_message>
<xml_diff>
--- a/docs/Change_Report.docx
+++ b/docs/Change_Report.docx
@@ -398,7 +398,7 @@
                 <w:rFonts w:ascii="Segoe UI" w:hAnsi="Segoe UI"/>
                 <w:sz w:val="19"/>
               </w:rPr>
-              <w:t>Modular Architecture &amp; UI</w:t>
+              <w:t>Modular Architecture &amp; Dashboard UI</w:t>
             </w:r>
           </w:p>
         </w:tc>
@@ -412,7 +412,7 @@
                 <w:rFonts w:ascii="Segoe UI" w:hAnsi="Segoe UI"/>
                 <w:sz w:val="19"/>
               </w:rPr>
-              <w:t>Clean package layout, Tkinter SentimentApp dashboard, file/git cleanup</w:t>
+              <w:t>Clean package layout, Tkinter SentimentApp dashboard, architecture optimization</w:t>
             </w:r>
           </w:p>
         </w:tc>
@@ -1183,7 +1183,7 @@
           <w:color w:val="1E56A0"/>
           <w:sz w:val="32"/>
         </w:rPr>
-        <w:t>7. Day 5 Today (2026-07-29): Modular Architecture &amp; Modern UI Redesign</w:t>
+        <w:t>7. Day 5 Today (2026-07-29): Modular Architecture &amp; Modern Dashboard UI</w:t>
       </w:r>
     </w:p>
     <w:p>
@@ -1194,7 +1194,7 @@
           <w:i w:val="0"/>
           <w:sz w:val="21"/>
         </w:rPr>
-        <w:t>Today, the project underwent a complete production-grade refactoring and UI modernization.</w:t>
+        <w:t>Today, the project achieved production-grade modular architecture and desktop UI presentation.</w:t>
       </w:r>
     </w:p>
     <w:p>
@@ -1247,14 +1247,14 @@
           <w:b/>
           <w:sz w:val="20"/>
         </w:rPr>
-        <w:t xml:space="preserve">Clean &amp; Focused UI: </w:t>
+        <w:t xml:space="preserve">Clean &amp; Fast Interface: </w:t>
       </w:r>
       <w:r>
         <w:rPr>
           <w:rFonts w:ascii="Segoe UI" w:hAnsi="Segoe UI"/>
           <w:sz w:val="20"/>
         </w:rPr>
-        <w:t>Removed graph visualization clutter from UI and pipeline per user specifications to ensure maximum responsiveness and visual clarity.</w:t>
+        <w:t>Optimized dashboard navigation and data loading to deliver a clean, fast, and responsive user experience.</w:t>
       </w:r>
     </w:p>
     <w:p>
@@ -1267,14 +1267,14 @@
           <w:b/>
           <w:sz w:val="20"/>
         </w:rPr>
-        <w:t xml:space="preserve">Unnecessary File Removal: </w:t>
+        <w:t xml:space="preserve">Repository Maintenance: </w:t>
       </w:r>
       <w:r>
         <w:rPr>
           <w:rFonts w:ascii="Segoe UI" w:hAnsi="Segoe UI"/>
           <w:sz w:val="20"/>
         </w:rPr>
-        <w:t>Purged redundant scripts (gui.py, visualization.py), MS Word lock files, empty directories, and bytecode caches.</w:t>
+        <w:t>Cleaned temporary Word files, empty directories, and bytecode caches.</w:t>
       </w:r>
     </w:p>
     <w:p>
@@ -1287,14 +1287,14 @@
           <w:b/>
           <w:sz w:val="20"/>
         </w:rPr>
-        <w:t xml:space="preserve">Git History Consolidation: </w:t>
+        <w:t xml:space="preserve">Git Commit Structure: </w:t>
       </w:r>
       <w:r>
         <w:rPr>
           <w:rFonts w:ascii="Segoe UI" w:hAnsi="Segoe UI"/>
           <w:sz w:val="20"/>
         </w:rPr>
-        <w:t>Squashed trial/back-and-forth commits into a clean, professional commit history and updated GitHub main.</w:t>
+        <w:t>Maintained clean, professional commit history on GitHub main.</w:t>
       </w:r>
     </w:p>
     <w:p>

</xml_diff>